<commit_message>
Block Method rollout batch 2 (pre-audit build): Aimee Morris, Mary Burfete, Johnna Macarthur, Nicolette Scott (gym + at-home)
Six-slot restructure per the green-lit method. Aimee's slot 4 carries Jason
Bethea's documented 8/10 shoulder/postural exercises; slots honestly omitted
where no corrective/Jason content exists. All prior audit-fix orderings
(8/12, 8/13, 8/16) preserved verbatim. Touch-rule pass: Kieser renames,
deload calls (proactive Wk5 Aimee/Johnna, combined Mary, autoregulated
Nicolette), 4-wk cadence language, Mary's retired absolute-trigger language
corrected per the Nicolette precedent, Nicolette's pre-existing
engine-function jargon leak in milestones8wk fixed. Independent audit in
progress; fixes will follow as a separate commit.

Co-Authored-By: Claude Fable 5 <noreply@anthropic.com>
Claude-Session: https://claude.ai/code/session_01VTRA12TAy4P16NRVKS4SK5
</commit_message>
<xml_diff>
--- a/clients/johnna_macarthur/Johnna_Macarthur_3Day_Training_Plan.docx
+++ b/clients/johnna_macarthur/Johnna_Macarthur_3Day_Training_Plan.docx
@@ -2789,6 +2789,56 @@
           <w:rFonts w:ascii="Arial" w:cs="Arial" w:eastAsia="Arial" w:hAnsi="Arial"/>
           <w:b/>
           <w:bCs/>
+          <w:color w:val="1565C0"/>
+          <w:sz w:val="17"/>
+          <w:szCs w:val="17"/>
+        </w:rPr>
+        <w:t xml:space="preserve">Planned Deload — Week 5, Directly After the Week 4 Strength Check:  </w:t>
+      </w:r>
+      <w:r>
+        <w:rPr>
+          <w:rFonts w:ascii="Arial" w:cs="Arial" w:eastAsia="Arial" w:hAnsi="Arial"/>
+          <w:color w:val="2C2C2C"/>
+          <w:sz w:val="17"/>
+          <w:szCs w:val="17"/>
+        </w:rPr>
+        <w:t xml:space="preserve">This program deliberately includes one lighter week, and it is planned, not a reaction to anything going wrong. Week 5 — immediately after the Week 4 strength check — is a structured deload: the same exercises and movement patterns, with sets reduced by roughly a third, every set held comfortably in the technique band (3 or more reps in reserve), and loads held at Week 3-4 levels rather than climbing — the usual add-weight rule pauses for this one week. With two brand-new lift baselines being established and a shoulder trained deliberately conservatively, this is how the program consolidates the strength built in Weeks 1-4 before Weeks 6-8 rebuild from the Week 4 loads toward the 8-week retest and rescan. One light week costs nothing that matters: muscle built over the previous month is not lost in a single reduced-volume week — only a small edge of peak strength dips, and it returns within days of resuming.</w:t>
+      </w:r>
+    </w:p>
+    <w:p>
+      <w:pPr>
+        <w:spacing w:after="100"/>
+      </w:pPr>
+      <w:r>
+        <w:rPr>
+          <w:rFonts w:ascii="Arial" w:cs="Arial" w:eastAsia="Arial" w:hAnsi="Arial"/>
+          <w:b/>
+          <w:bCs/>
+          <w:color w:val="C9A227"/>
+          <w:sz w:val="17"/>
+          <w:szCs w:val="17"/>
+        </w:rPr>
+        <w:t xml:space="preserve">Session Architecture — ICONS Block Method Restructure (8/19/2026):  </w:t>
+      </w:r>
+      <w:r>
+        <w:rPr>
+          <w:rFonts w:ascii="Arial" w:cs="Arial" w:eastAsia="Arial" w:hAnsi="Arial"/>
+          <w:color w:val="2C2C2C"/>
+          <w:sz w:val="17"/>
+          <w:szCs w:val="17"/>
+        </w:rPr>
+        <w:t xml:space="preserve">All three days restructured onto the ICONS Block Method six-slot order (Corrective → Primary Compound → Accessory → Jason's Exercise → Secondary Compound → Third Compound/Integration). Slot 4 omitted on all days — no Jason Bethea exercise or coordinated-care relationship on file (her shoulder work is a self-contained corrective priority per intake); no filler inserted. Day 1: corrective = Hip Activation &amp; 90/90; primary = Goblet Squat; accessory = the Tibia &amp; Inner-Thigh pairing, MOVED between the two lifts (the one genuine resequencing — previous order was Squat → Trap Bar DL → tibia block; antagonist walk clean: squat → isolated correctives → hinge; no documented audit-fix ordering existed on this day); secondary = Trap Bar Deadlift; integration = NEW light Farmers Carry (2x25-30 yd, 20-25 lbs/hand, anchored below her tested 30 lbs/hand baseline). Day 2: corrective = Shoulder Internal Rotation; primary = Seated OHP (split from the old press block); accessory = Incline Push-Up; secondary = row/face-pull/incline-press block unchanged; integration = NEW Farmers Carry, packed-shoulder framing (shoulder-safe by design — overhead carry excluded on constraint grounds). CLAUDE.md's shoulder-reintroduction addendum (press → closed-chain hold) was considered and deliberately not applied: its scope is a reintroduced press after rehab/reconstruction; her OHP is a tested, continuously-programmed lift under a corrective gate, not a reintroduction. Day 3: primary = DB Hip Thrust; accessory = SL RDL (left-led); secondary = Reverse Lunge + tibia/Copenhagen touch-up; integration = the existing Carry + Core block retitled (Farmers Carry rirNote aligned to the carry convention; suitcase/front-rack options alternate sides — arms effectively even, no lead fabricated). Options menus on every compound slot, constraint-filtered: technique-band options only on the two not-yet-baselined patterns; every press option inside the pain-free-range/sharp-pinch stop rule; no overhead carries or ballistic overhead options anywhere. Same pass: Face Pull renamed (Band or Kieser), proactive Week-5 deload added, 4-week strength / 8-12-week Styku cadence split stated, warm-up drift checked clean, 10-movement coverage re-verified intact.</w:t>
+      </w:r>
+    </w:p>
+    <w:p>
+      <w:pPr>
+        <w:spacing w:after="100"/>
+      </w:pPr>
+      <w:r>
+        <w:rPr>
+          <w:rFonts w:ascii="Arial" w:cs="Arial" w:eastAsia="Arial" w:hAnsi="Arial"/>
+          <w:b/>
+          <w:bCs/>
           <w:color w:val="00695C"/>
           <w:sz w:val="17"/>
           <w:szCs w:val="17"/>
@@ -4363,7 +4413,7 @@
           <w:sz w:val="17"/>
           <w:szCs w:val="17"/>
         </w:rPr>
-        <w:t xml:space="preserve">B — PRIMARY STRENGTH — SQUAT &amp; DEADLIFT TECHNIQUE INTRODUCTION</w:t>
+        <w:t xml:space="preserve">B — PRIMARY COMPOUND — GOBLET SQUAT (BASELINE ESTABLISHMENT)</w:t>
       </w:r>
     </w:p>
     <w:p>
@@ -4388,7 +4438,7 @@
           <w:sz w:val="17"/>
           <w:szCs w:val="17"/>
         </w:rPr>
-        <w:t xml:space="preserve">No baseline was recorded for squat or deadlift. Loads stay light — the goal is a clean, repeatable pattern that becomes today's new baseline, not maximal load.</w:t>
+        <w:t xml:space="preserve">No baseline was recorded for the squat. Today's deliberately light load becomes the new baseline — the goal is a clean, repeatable pattern, not maximal weight. If the day calls for a variation while the pattern is still being established, both options stay in the same technique band: a box squat (depth set by the box) or a supported split-stance squat holding a rail (left leg leads). The goblet squat stays the lift we track — its working load is the number that becomes the 8-week baseline.</w:t>
       </w:r>
     </w:p>
     <w:tbl>
@@ -4899,246 +4949,6 @@
           </w:p>
         </w:tc>
       </w:tr>
-      <w:tr>
-        <w:tc>
-          <w:tcPr>
-            <w:tcW w:type="dxa" w:w="2400"/>
-            <w:tcBorders>
-              <w:top w:val="none" w:color="FFFFFF" w:sz="0"/>
-              <w:left w:val="none" w:color="FFFFFF" w:sz="0"/>
-              <w:bottom w:val="none" w:color="FFFFFF" w:sz="0"/>
-              <w:right w:val="none" w:color="FFFFFF" w:sz="0"/>
-            </w:tcBorders>
-            <w:shd w:fill="FFFFFF" w:color="auto" w:val="clear"/>
-            <w:tcMar>
-              <w:top w:type="dxa" w:w="40"/>
-              <w:left w:type="dxa" w:w="80"/>
-              <w:bottom w:type="dxa" w:w="40"/>
-              <w:right w:type="dxa" w:w="80"/>
-            </w:tcMar>
-            <w:vAlign w:val="center"/>
-          </w:tcPr>
-          <w:p>
-            <w:r>
-              <w:rPr>
-                <w:rFonts w:ascii="Arial" w:cs="Arial" w:eastAsia="Arial" w:hAnsi="Arial"/>
-                <w:b/>
-                <w:bCs/>
-                <w:color w:val="2C2C2C"/>
-                <w:sz w:val="18"/>
-                <w:szCs w:val="18"/>
-              </w:rPr>
-              <w:t xml:space="preserve">Trap Bar Deadlift</w:t>
-            </w:r>
-          </w:p>
-        </w:tc>
-        <w:tc>
-          <w:tcPr>
-            <w:tcW w:type="dxa" w:w="380"/>
-            <w:tcBorders>
-              <w:top w:val="none" w:color="FFFFFF" w:sz="0"/>
-              <w:left w:val="none" w:color="FFFFFF" w:sz="0"/>
-              <w:bottom w:val="none" w:color="FFFFFF" w:sz="0"/>
-              <w:right w:val="none" w:color="FFFFFF" w:sz="0"/>
-            </w:tcBorders>
-            <w:shd w:fill="FFFFFF" w:color="auto" w:val="clear"/>
-            <w:tcMar>
-              <w:top w:type="dxa" w:w="40"/>
-              <w:left w:type="dxa" w:w="80"/>
-              <w:bottom w:type="dxa" w:w="40"/>
-              <w:right w:type="dxa" w:w="80"/>
-            </w:tcMar>
-            <w:vAlign w:val="center"/>
-          </w:tcPr>
-          <w:p>
-            <w:pPr>
-              <w:jc w:val="center"/>
-            </w:pPr>
-            <w:r>
-              <w:rPr>
-                <w:rFonts w:ascii="Arial" w:cs="Arial" w:eastAsia="Arial" w:hAnsi="Arial"/>
-                <w:color w:val="6B6B6B"/>
-                <w:sz w:val="15"/>
-                <w:szCs w:val="15"/>
-              </w:rPr>
-              <w:t xml:space="preserve">3</w:t>
-            </w:r>
-          </w:p>
-        </w:tc>
-        <w:tc>
-          <w:tcPr>
-            <w:tcW w:type="dxa" w:w="420"/>
-            <w:tcBorders>
-              <w:top w:val="none" w:color="FFFFFF" w:sz="0"/>
-              <w:left w:val="none" w:color="FFFFFF" w:sz="0"/>
-              <w:bottom w:val="none" w:color="FFFFFF" w:sz="0"/>
-              <w:right w:val="none" w:color="FFFFFF" w:sz="0"/>
-            </w:tcBorders>
-            <w:shd w:fill="FFFFFF" w:color="auto" w:val="clear"/>
-            <w:tcMar>
-              <w:top w:type="dxa" w:w="40"/>
-              <w:left w:type="dxa" w:w="80"/>
-              <w:bottom w:type="dxa" w:w="40"/>
-              <w:right w:type="dxa" w:w="80"/>
-            </w:tcMar>
-            <w:vAlign w:val="center"/>
-          </w:tcPr>
-          <w:p>
-            <w:pPr>
-              <w:jc w:val="center"/>
-            </w:pPr>
-            <w:r>
-              <w:rPr>
-                <w:rFonts w:ascii="Arial" w:cs="Arial" w:eastAsia="Arial" w:hAnsi="Arial"/>
-                <w:color w:val="6B6B6B"/>
-                <w:sz w:val="15"/>
-                <w:szCs w:val="15"/>
-              </w:rPr>
-              <w:t xml:space="preserve">6</w:t>
-            </w:r>
-          </w:p>
-        </w:tc>
-        <w:tc>
-          <w:tcPr>
-            <w:tcW w:type="dxa" w:w="680"/>
-            <w:tcBorders>
-              <w:top w:val="none" w:color="FFFFFF" w:sz="0"/>
-              <w:left w:val="none" w:color="FFFFFF" w:sz="0"/>
-              <w:bottom w:val="none" w:color="FFFFFF" w:sz="0"/>
-              <w:right w:val="none" w:color="FFFFFF" w:sz="0"/>
-            </w:tcBorders>
-            <w:shd w:fill="FFFFFF" w:color="auto" w:val="clear"/>
-            <w:tcMar>
-              <w:top w:type="dxa" w:w="40"/>
-              <w:left w:type="dxa" w:w="80"/>
-              <w:bottom w:type="dxa" w:w="40"/>
-              <w:right w:type="dxa" w:w="80"/>
-            </w:tcMar>
-            <w:vAlign w:val="center"/>
-          </w:tcPr>
-          <w:p>
-            <w:pPr>
-              <w:jc w:val="center"/>
-            </w:pPr>
-            <w:r>
-              <w:rPr>
-                <w:rFonts w:ascii="Arial" w:cs="Arial" w:eastAsia="Arial" w:hAnsi="Arial"/>
-                <w:color w:val="6B6B6B"/>
-                <w:sz w:val="15"/>
-                <w:szCs w:val="15"/>
-              </w:rPr>
-              <w:t xml:space="preserve">55 lbs</w:t>
-            </w:r>
-          </w:p>
-        </w:tc>
-        <w:tc>
-          <w:tcPr>
-            <w:tcW w:type="dxa" w:w="540"/>
-            <w:tcBorders>
-              <w:top w:val="none" w:color="FFFFFF" w:sz="0"/>
-              <w:left w:val="none" w:color="FFFFFF" w:sz="0"/>
-              <w:bottom w:val="none" w:color="FFFFFF" w:sz="0"/>
-              <w:right w:val="none" w:color="FFFFFF" w:sz="0"/>
-            </w:tcBorders>
-            <w:shd w:fill="FFFFFF" w:color="auto" w:val="clear"/>
-            <w:tcMar>
-              <w:top w:type="dxa" w:w="40"/>
-              <w:left w:type="dxa" w:w="80"/>
-              <w:bottom w:type="dxa" w:w="40"/>
-              <w:right w:type="dxa" w:w="80"/>
-            </w:tcMar>
-            <w:vAlign w:val="center"/>
-          </w:tcPr>
-          <w:p>
-            <w:pPr>
-              <w:jc w:val="center"/>
-            </w:pPr>
-            <w:r>
-              <w:rPr>
-                <w:rFonts w:ascii="Arial" w:cs="Arial" w:eastAsia="Arial" w:hAnsi="Arial"/>
-                <w:color w:val="6B6B6B"/>
-                <w:sz w:val="15"/>
-                <w:szCs w:val="15"/>
-              </w:rPr>
-              <w:t xml:space="preserve">2-1-1</w:t>
-            </w:r>
-          </w:p>
-        </w:tc>
-        <w:tc>
-          <w:tcPr>
-            <w:tcW w:type="dxa" w:w="440"/>
-            <w:tcBorders>
-              <w:top w:val="none" w:color="FFFFFF" w:sz="0"/>
-              <w:left w:val="none" w:color="FFFFFF" w:sz="0"/>
-              <w:bottom w:val="none" w:color="FFFFFF" w:sz="0"/>
-              <w:right w:val="none" w:color="FFFFFF" w:sz="0"/>
-            </w:tcBorders>
-            <w:shd w:fill="FFFFFF" w:color="auto" w:val="clear"/>
-            <w:tcMar>
-              <w:top w:type="dxa" w:w="40"/>
-              <w:left w:type="dxa" w:w="80"/>
-              <w:bottom w:type="dxa" w:w="40"/>
-              <w:right w:type="dxa" w:w="80"/>
-            </w:tcMar>
-            <w:vAlign w:val="center"/>
-          </w:tcPr>
-          <w:p>
-            <w:pPr>
-              <w:jc w:val="center"/>
-            </w:pPr>
-            <w:r>
-              <w:rPr>
-                <w:rFonts w:ascii="Arial" w:cs="Arial" w:eastAsia="Arial" w:hAnsi="Arial"/>
-                <w:color w:val="6B6B6B"/>
-                <w:sz w:val="15"/>
-                <w:szCs w:val="15"/>
-              </w:rPr>
-              <w:t xml:space="preserve">90s</w:t>
-            </w:r>
-          </w:p>
-        </w:tc>
-        <w:tc>
-          <w:tcPr>
-            <w:tcW w:type="dxa" w:w="5580"/>
-            <w:tcBorders>
-              <w:top w:val="none" w:color="FFFFFF" w:sz="0"/>
-              <w:left w:val="none" w:color="FFFFFF" w:sz="0"/>
-              <w:bottom w:val="none" w:color="FFFFFF" w:sz="0"/>
-              <w:right w:val="none" w:color="FFFFFF" w:sz="0"/>
-            </w:tcBorders>
-            <w:shd w:fill="FFFFFF" w:color="auto" w:val="clear"/>
-            <w:tcMar>
-              <w:top w:type="dxa" w:w="40"/>
-              <w:left w:type="dxa" w:w="80"/>
-              <w:bottom w:type="dxa" w:w="40"/>
-              <w:right w:type="dxa" w:w="80"/>
-            </w:tcMar>
-            <w:vAlign w:val="center"/>
-          </w:tcPr>
-          <w:p>
-            <w:r>
-              <w:rPr>
-                <w:rFonts w:ascii="Arial" w:cs="Arial" w:eastAsia="Arial" w:hAnsi="Arial"/>
-                <w:color w:val="6B6B6B"/>
-                <w:sz w:val="17"/>
-                <w:szCs w:val="17"/>
-              </w:rPr>
-              <w:t xml:space="preserve">Flat back, brace, push floor away evenly.</w:t>
-            </w:r>
-            <w:r>
-              <w:rPr>
-                <w:rFonts w:ascii="Arial" w:cs="Arial" w:eastAsia="Arial" w:hAnsi="Arial"/>
-                <w:i/>
-                <w:iCs/>
-                <w:color w:val="00695C"/>
-                <w:sz w:val="14"/>
-                <w:szCs w:val="14"/>
-              </w:rPr>
-              <w:t xml:space="preserve">  3+ RIR</w:t>
-            </w:r>
-          </w:p>
-        </w:tc>
-      </w:tr>
     </w:tbl>
     <w:p>
       <w:pPr>
@@ -5158,7 +4968,7 @@
           <w:sz w:val="17"/>
           <w:szCs w:val="17"/>
         </w:rPr>
-        <w:t xml:space="preserve">C — TIBIA &amp; INNER-THIGH CORRECTIVE PAIRING</w:t>
+        <w:t xml:space="preserve">C — ACCESSORY — TIBIA &amp; INNER-THIGH CORRECTIVE PAIRING</w:t>
       </w:r>
     </w:p>
     <w:p>
@@ -5183,7 +4993,7 @@
           <w:sz w:val="17"/>
           <w:szCs w:val="17"/>
         </w:rPr>
-        <w:t xml:space="preserve">Tibialis strength and inner-thigh/adductor activation are paired corrective priorities from intake — tibialis raises build the ankle-dorsiflexion control that supports squat and lunge mechanics, while the adductor work balances the lateral hip-abductor emphasis in Block A.</w:t>
+        <w:t xml:space="preserve">Tibialis strength and inner-thigh/adductor activation are paired corrective priorities from intake — tibialis raises build the ankle-dorsiflexion control that supports squat and lunge mechanics, while the adductor work balances the lateral hip-abductor emphasis in Block A. Placed between today's two main lifts, this work also gives the legs a controlled breather before the hinge pattern below.</w:t>
       </w:r>
     </w:p>
     <w:tbl>
@@ -6389,7 +6199,1117 @@
           <w:sz w:val="17"/>
           <w:szCs w:val="17"/>
         </w:rPr>
-        <w:t xml:space="preserve">D — METABOLIC FINISHER</w:t>
+        <w:t xml:space="preserve">D — SECONDARY COMPOUND — TRAP BAR DEADLIFT (BASELINE ESTABLISHMENT)</w:t>
+      </w:r>
+    </w:p>
+    <w:p>
+      <w:pPr>
+        <w:spacing w:after="80"/>
+      </w:pPr>
+      <w:r>
+        <w:rPr>
+          <w:rFonts w:ascii="Arial" w:cs="Arial" w:eastAsia="Arial" w:hAnsi="Arial"/>
+          <w:b/>
+          <w:bCs/>
+          <w:color w:val="00695C"/>
+          <w:sz w:val="17"/>
+          <w:szCs w:val="17"/>
+        </w:rPr>
+        <w:t xml:space="preserve">Load Target:  </w:t>
+      </w:r>
+      <w:r>
+        <w:rPr>
+          <w:rFonts w:ascii="Arial" w:cs="Arial" w:eastAsia="Arial" w:hAnsi="Arial"/>
+          <w:color w:val="2C2C2C"/>
+          <w:sz w:val="17"/>
+          <w:szCs w:val="17"/>
+        </w:rPr>
+        <w:t xml:space="preserve">The day's second compound pattern — a hinge, rotating off the squat work above. No baseline was recorded for the deadlift; today's deliberately light load becomes the new baseline. If a variation is needed while the pattern is established, both options stay in the same technique band: a trap bar pull from low blocks (shortened range) or a light double-DB Romanian deadlift. The trap bar lift stays the one we track — its working load becomes the 8-week baseline.</w:t>
+      </w:r>
+    </w:p>
+    <w:tbl>
+      <w:tblPr>
+        <w:tblW w:type="dxa" w:w="10440"/>
+        <w:tblBorders>
+          <w:top w:val="none" w:color="FFFFFF" w:sz="0"/>
+          <w:left w:val="none" w:color="FFFFFF" w:sz="0"/>
+          <w:bottom w:val="none" w:color="FFFFFF" w:sz="0"/>
+          <w:right w:val="none" w:color="FFFFFF" w:sz="0"/>
+          <w:insideH w:val="single" w:color="auto" w:sz="4"/>
+          <w:insideV w:val="single" w:color="auto" w:sz="4"/>
+        </w:tblBorders>
+      </w:tblPr>
+      <w:tblGrid>
+        <w:gridCol w:w="2400"/>
+        <w:gridCol w:w="380"/>
+        <w:gridCol w:w="420"/>
+        <w:gridCol w:w="680"/>
+        <w:gridCol w:w="540"/>
+        <w:gridCol w:w="440"/>
+        <w:gridCol w:w="5580"/>
+      </w:tblGrid>
+      <w:tr>
+        <w:tc>
+          <w:tcPr>
+            <w:tcW w:type="dxa" w:w="2400"/>
+            <w:tcBorders>
+              <w:top w:val="none" w:color="FFFFFF" w:sz="0"/>
+              <w:left w:val="none" w:color="FFFFFF" w:sz="0"/>
+              <w:bottom w:val="none" w:color="FFFFFF" w:sz="0"/>
+              <w:right w:val="none" w:color="FFFFFF" w:sz="0"/>
+            </w:tcBorders>
+            <w:shd w:fill="E0F2F1" w:color="auto" w:val="clear"/>
+            <w:tcMar>
+              <w:top w:type="dxa" w:w="40"/>
+              <w:left w:type="dxa" w:w="80"/>
+              <w:bottom w:type="dxa" w:w="40"/>
+              <w:right w:type="dxa" w:w="80"/>
+            </w:tcMar>
+            <w:vAlign w:val="center"/>
+          </w:tcPr>
+          <w:p>
+            <w:pPr>
+              <w:jc w:val="left"/>
+            </w:pPr>
+            <w:r>
+              <w:rPr>
+                <w:rFonts w:ascii="Arial" w:cs="Arial" w:eastAsia="Arial" w:hAnsi="Arial"/>
+                <w:b/>
+                <w:bCs/>
+                <w:color w:val="00695C"/>
+                <w:sz w:val="15"/>
+                <w:szCs w:val="15"/>
+              </w:rPr>
+              <w:t xml:space="preserve">EXERCISE</w:t>
+            </w:r>
+          </w:p>
+        </w:tc>
+        <w:tc>
+          <w:tcPr>
+            <w:tcW w:type="dxa" w:w="380"/>
+            <w:tcBorders>
+              <w:top w:val="none" w:color="FFFFFF" w:sz="0"/>
+              <w:left w:val="none" w:color="FFFFFF" w:sz="0"/>
+              <w:bottom w:val="none" w:color="FFFFFF" w:sz="0"/>
+              <w:right w:val="none" w:color="FFFFFF" w:sz="0"/>
+            </w:tcBorders>
+            <w:shd w:fill="E0F2F1" w:color="auto" w:val="clear"/>
+            <w:tcMar>
+              <w:top w:type="dxa" w:w="40"/>
+              <w:left w:type="dxa" w:w="80"/>
+              <w:bottom w:type="dxa" w:w="40"/>
+              <w:right w:type="dxa" w:w="80"/>
+            </w:tcMar>
+            <w:vAlign w:val="center"/>
+          </w:tcPr>
+          <w:p>
+            <w:pPr>
+              <w:jc w:val="center"/>
+            </w:pPr>
+            <w:r>
+              <w:rPr>
+                <w:rFonts w:ascii="Arial" w:cs="Arial" w:eastAsia="Arial" w:hAnsi="Arial"/>
+                <w:b/>
+                <w:bCs/>
+                <w:color w:val="00695C"/>
+                <w:sz w:val="13"/>
+                <w:szCs w:val="13"/>
+              </w:rPr>
+              <w:t xml:space="preserve">SETS</w:t>
+            </w:r>
+          </w:p>
+        </w:tc>
+        <w:tc>
+          <w:tcPr>
+            <w:tcW w:type="dxa" w:w="420"/>
+            <w:tcBorders>
+              <w:top w:val="none" w:color="FFFFFF" w:sz="0"/>
+              <w:left w:val="none" w:color="FFFFFF" w:sz="0"/>
+              <w:bottom w:val="none" w:color="FFFFFF" w:sz="0"/>
+              <w:right w:val="none" w:color="FFFFFF" w:sz="0"/>
+            </w:tcBorders>
+            <w:shd w:fill="E0F2F1" w:color="auto" w:val="clear"/>
+            <w:tcMar>
+              <w:top w:type="dxa" w:w="40"/>
+              <w:left w:type="dxa" w:w="80"/>
+              <w:bottom w:type="dxa" w:w="40"/>
+              <w:right w:type="dxa" w:w="80"/>
+            </w:tcMar>
+            <w:vAlign w:val="center"/>
+          </w:tcPr>
+          <w:p>
+            <w:pPr>
+              <w:jc w:val="center"/>
+            </w:pPr>
+            <w:r>
+              <w:rPr>
+                <w:rFonts w:ascii="Arial" w:cs="Arial" w:eastAsia="Arial" w:hAnsi="Arial"/>
+                <w:b/>
+                <w:bCs/>
+                <w:color w:val="00695C"/>
+                <w:sz w:val="13"/>
+                <w:szCs w:val="13"/>
+              </w:rPr>
+              <w:t xml:space="preserve">REPS</w:t>
+            </w:r>
+          </w:p>
+        </w:tc>
+        <w:tc>
+          <w:tcPr>
+            <w:tcW w:type="dxa" w:w="680"/>
+            <w:tcBorders>
+              <w:top w:val="none" w:color="FFFFFF" w:sz="0"/>
+              <w:left w:val="none" w:color="FFFFFF" w:sz="0"/>
+              <w:bottom w:val="none" w:color="FFFFFF" w:sz="0"/>
+              <w:right w:val="none" w:color="FFFFFF" w:sz="0"/>
+            </w:tcBorders>
+            <w:shd w:fill="E0F2F1" w:color="auto" w:val="clear"/>
+            <w:tcMar>
+              <w:top w:type="dxa" w:w="40"/>
+              <w:left w:type="dxa" w:w="80"/>
+              <w:bottom w:type="dxa" w:w="40"/>
+              <w:right w:type="dxa" w:w="80"/>
+            </w:tcMar>
+            <w:vAlign w:val="center"/>
+          </w:tcPr>
+          <w:p>
+            <w:pPr>
+              <w:jc w:val="center"/>
+            </w:pPr>
+            <w:r>
+              <w:rPr>
+                <w:rFonts w:ascii="Arial" w:cs="Arial" w:eastAsia="Arial" w:hAnsi="Arial"/>
+                <w:b/>
+                <w:bCs/>
+                <w:color w:val="00695C"/>
+                <w:sz w:val="13"/>
+                <w:szCs w:val="13"/>
+              </w:rPr>
+              <w:t xml:space="preserve">LOAD</w:t>
+            </w:r>
+          </w:p>
+        </w:tc>
+        <w:tc>
+          <w:tcPr>
+            <w:tcW w:type="dxa" w:w="540"/>
+            <w:tcBorders>
+              <w:top w:val="none" w:color="FFFFFF" w:sz="0"/>
+              <w:left w:val="none" w:color="FFFFFF" w:sz="0"/>
+              <w:bottom w:val="none" w:color="FFFFFF" w:sz="0"/>
+              <w:right w:val="none" w:color="FFFFFF" w:sz="0"/>
+            </w:tcBorders>
+            <w:shd w:fill="E0F2F1" w:color="auto" w:val="clear"/>
+            <w:tcMar>
+              <w:top w:type="dxa" w:w="40"/>
+              <w:left w:type="dxa" w:w="80"/>
+              <w:bottom w:type="dxa" w:w="40"/>
+              <w:right w:type="dxa" w:w="80"/>
+            </w:tcMar>
+            <w:vAlign w:val="center"/>
+          </w:tcPr>
+          <w:p>
+            <w:pPr>
+              <w:jc w:val="center"/>
+            </w:pPr>
+            <w:r>
+              <w:rPr>
+                <w:rFonts w:ascii="Arial" w:cs="Arial" w:eastAsia="Arial" w:hAnsi="Arial"/>
+                <w:b/>
+                <w:bCs/>
+                <w:color w:val="00695C"/>
+                <w:sz w:val="13"/>
+                <w:szCs w:val="13"/>
+              </w:rPr>
+              <w:t xml:space="preserve">TEMPO</w:t>
+            </w:r>
+          </w:p>
+        </w:tc>
+        <w:tc>
+          <w:tcPr>
+            <w:tcW w:type="dxa" w:w="440"/>
+            <w:tcBorders>
+              <w:top w:val="none" w:color="FFFFFF" w:sz="0"/>
+              <w:left w:val="none" w:color="FFFFFF" w:sz="0"/>
+              <w:bottom w:val="none" w:color="FFFFFF" w:sz="0"/>
+              <w:right w:val="none" w:color="FFFFFF" w:sz="0"/>
+            </w:tcBorders>
+            <w:shd w:fill="E0F2F1" w:color="auto" w:val="clear"/>
+            <w:tcMar>
+              <w:top w:type="dxa" w:w="40"/>
+              <w:left w:type="dxa" w:w="80"/>
+              <w:bottom w:type="dxa" w:w="40"/>
+              <w:right w:type="dxa" w:w="80"/>
+            </w:tcMar>
+            <w:vAlign w:val="center"/>
+          </w:tcPr>
+          <w:p>
+            <w:pPr>
+              <w:jc w:val="center"/>
+            </w:pPr>
+            <w:r>
+              <w:rPr>
+                <w:rFonts w:ascii="Arial" w:cs="Arial" w:eastAsia="Arial" w:hAnsi="Arial"/>
+                <w:b/>
+                <w:bCs/>
+                <w:color w:val="00695C"/>
+                <w:sz w:val="13"/>
+                <w:szCs w:val="13"/>
+              </w:rPr>
+              <w:t xml:space="preserve">REST</w:t>
+            </w:r>
+          </w:p>
+        </w:tc>
+        <w:tc>
+          <w:tcPr>
+            <w:tcW w:type="dxa" w:w="5580"/>
+            <w:tcBorders>
+              <w:top w:val="none" w:color="FFFFFF" w:sz="0"/>
+              <w:left w:val="none" w:color="FFFFFF" w:sz="0"/>
+              <w:bottom w:val="none" w:color="FFFFFF" w:sz="0"/>
+              <w:right w:val="none" w:color="FFFFFF" w:sz="0"/>
+            </w:tcBorders>
+            <w:shd w:fill="E0F2F1" w:color="auto" w:val="clear"/>
+            <w:tcMar>
+              <w:top w:type="dxa" w:w="40"/>
+              <w:left w:type="dxa" w:w="80"/>
+              <w:bottom w:type="dxa" w:w="40"/>
+              <w:right w:type="dxa" w:w="80"/>
+            </w:tcMar>
+            <w:vAlign w:val="center"/>
+          </w:tcPr>
+          <w:p>
+            <w:pPr>
+              <w:jc w:val="left"/>
+            </w:pPr>
+            <w:r>
+              <w:rPr>
+                <w:rFonts w:ascii="Arial" w:cs="Arial" w:eastAsia="Arial" w:hAnsi="Arial"/>
+                <w:b/>
+                <w:bCs/>
+                <w:color w:val="00695C"/>
+                <w:sz w:val="15"/>
+                <w:szCs w:val="15"/>
+              </w:rPr>
+              <w:t xml:space="preserve">COACHING CUE</w:t>
+            </w:r>
+          </w:p>
+        </w:tc>
+      </w:tr>
+      <w:tr>
+        <w:tc>
+          <w:tcPr>
+            <w:tcW w:type="dxa" w:w="2400"/>
+            <w:tcBorders>
+              <w:top w:val="none" w:color="FFFFFF" w:sz="0"/>
+              <w:left w:val="none" w:color="FFFFFF" w:sz="0"/>
+              <w:bottom w:val="none" w:color="FFFFFF" w:sz="0"/>
+              <w:right w:val="none" w:color="FFFFFF" w:sz="0"/>
+            </w:tcBorders>
+            <w:shd w:fill="F0FAFA" w:color="auto" w:val="clear"/>
+            <w:tcMar>
+              <w:top w:type="dxa" w:w="40"/>
+              <w:left w:type="dxa" w:w="80"/>
+              <w:bottom w:type="dxa" w:w="40"/>
+              <w:right w:type="dxa" w:w="80"/>
+            </w:tcMar>
+            <w:vAlign w:val="center"/>
+          </w:tcPr>
+          <w:p>
+            <w:r>
+              <w:rPr>
+                <w:rFonts w:ascii="Arial" w:cs="Arial" w:eastAsia="Arial" w:hAnsi="Arial"/>
+                <w:b/>
+                <w:bCs/>
+                <w:color w:val="2C2C2C"/>
+                <w:sz w:val="18"/>
+                <w:szCs w:val="18"/>
+              </w:rPr>
+              <w:t xml:space="preserve">Trap Bar Deadlift</w:t>
+            </w:r>
+          </w:p>
+        </w:tc>
+        <w:tc>
+          <w:tcPr>
+            <w:tcW w:type="dxa" w:w="380"/>
+            <w:tcBorders>
+              <w:top w:val="none" w:color="FFFFFF" w:sz="0"/>
+              <w:left w:val="none" w:color="FFFFFF" w:sz="0"/>
+              <w:bottom w:val="none" w:color="FFFFFF" w:sz="0"/>
+              <w:right w:val="none" w:color="FFFFFF" w:sz="0"/>
+            </w:tcBorders>
+            <w:shd w:fill="F0FAFA" w:color="auto" w:val="clear"/>
+            <w:tcMar>
+              <w:top w:type="dxa" w:w="40"/>
+              <w:left w:type="dxa" w:w="80"/>
+              <w:bottom w:type="dxa" w:w="40"/>
+              <w:right w:type="dxa" w:w="80"/>
+            </w:tcMar>
+            <w:vAlign w:val="center"/>
+          </w:tcPr>
+          <w:p>
+            <w:pPr>
+              <w:jc w:val="center"/>
+            </w:pPr>
+            <w:r>
+              <w:rPr>
+                <w:rFonts w:ascii="Arial" w:cs="Arial" w:eastAsia="Arial" w:hAnsi="Arial"/>
+                <w:color w:val="6B6B6B"/>
+                <w:sz w:val="15"/>
+                <w:szCs w:val="15"/>
+              </w:rPr>
+              <w:t xml:space="preserve">3</w:t>
+            </w:r>
+          </w:p>
+        </w:tc>
+        <w:tc>
+          <w:tcPr>
+            <w:tcW w:type="dxa" w:w="420"/>
+            <w:tcBorders>
+              <w:top w:val="none" w:color="FFFFFF" w:sz="0"/>
+              <w:left w:val="none" w:color="FFFFFF" w:sz="0"/>
+              <w:bottom w:val="none" w:color="FFFFFF" w:sz="0"/>
+              <w:right w:val="none" w:color="FFFFFF" w:sz="0"/>
+            </w:tcBorders>
+            <w:shd w:fill="F0FAFA" w:color="auto" w:val="clear"/>
+            <w:tcMar>
+              <w:top w:type="dxa" w:w="40"/>
+              <w:left w:type="dxa" w:w="80"/>
+              <w:bottom w:type="dxa" w:w="40"/>
+              <w:right w:type="dxa" w:w="80"/>
+            </w:tcMar>
+            <w:vAlign w:val="center"/>
+          </w:tcPr>
+          <w:p>
+            <w:pPr>
+              <w:jc w:val="center"/>
+            </w:pPr>
+            <w:r>
+              <w:rPr>
+                <w:rFonts w:ascii="Arial" w:cs="Arial" w:eastAsia="Arial" w:hAnsi="Arial"/>
+                <w:color w:val="6B6B6B"/>
+                <w:sz w:val="15"/>
+                <w:szCs w:val="15"/>
+              </w:rPr>
+              <w:t xml:space="preserve">6</w:t>
+            </w:r>
+          </w:p>
+        </w:tc>
+        <w:tc>
+          <w:tcPr>
+            <w:tcW w:type="dxa" w:w="680"/>
+            <w:tcBorders>
+              <w:top w:val="none" w:color="FFFFFF" w:sz="0"/>
+              <w:left w:val="none" w:color="FFFFFF" w:sz="0"/>
+              <w:bottom w:val="none" w:color="FFFFFF" w:sz="0"/>
+              <w:right w:val="none" w:color="FFFFFF" w:sz="0"/>
+            </w:tcBorders>
+            <w:shd w:fill="F0FAFA" w:color="auto" w:val="clear"/>
+            <w:tcMar>
+              <w:top w:type="dxa" w:w="40"/>
+              <w:left w:type="dxa" w:w="80"/>
+              <w:bottom w:type="dxa" w:w="40"/>
+              <w:right w:type="dxa" w:w="80"/>
+            </w:tcMar>
+            <w:vAlign w:val="center"/>
+          </w:tcPr>
+          <w:p>
+            <w:pPr>
+              <w:jc w:val="center"/>
+            </w:pPr>
+            <w:r>
+              <w:rPr>
+                <w:rFonts w:ascii="Arial" w:cs="Arial" w:eastAsia="Arial" w:hAnsi="Arial"/>
+                <w:color w:val="6B6B6B"/>
+                <w:sz w:val="15"/>
+                <w:szCs w:val="15"/>
+              </w:rPr>
+              <w:t xml:space="preserve">55 lbs</w:t>
+            </w:r>
+          </w:p>
+        </w:tc>
+        <w:tc>
+          <w:tcPr>
+            <w:tcW w:type="dxa" w:w="540"/>
+            <w:tcBorders>
+              <w:top w:val="none" w:color="FFFFFF" w:sz="0"/>
+              <w:left w:val="none" w:color="FFFFFF" w:sz="0"/>
+              <w:bottom w:val="none" w:color="FFFFFF" w:sz="0"/>
+              <w:right w:val="none" w:color="FFFFFF" w:sz="0"/>
+            </w:tcBorders>
+            <w:shd w:fill="F0FAFA" w:color="auto" w:val="clear"/>
+            <w:tcMar>
+              <w:top w:type="dxa" w:w="40"/>
+              <w:left w:type="dxa" w:w="80"/>
+              <w:bottom w:type="dxa" w:w="40"/>
+              <w:right w:type="dxa" w:w="80"/>
+            </w:tcMar>
+            <w:vAlign w:val="center"/>
+          </w:tcPr>
+          <w:p>
+            <w:pPr>
+              <w:jc w:val="center"/>
+            </w:pPr>
+            <w:r>
+              <w:rPr>
+                <w:rFonts w:ascii="Arial" w:cs="Arial" w:eastAsia="Arial" w:hAnsi="Arial"/>
+                <w:color w:val="6B6B6B"/>
+                <w:sz w:val="15"/>
+                <w:szCs w:val="15"/>
+              </w:rPr>
+              <w:t xml:space="preserve">2-1-1</w:t>
+            </w:r>
+          </w:p>
+        </w:tc>
+        <w:tc>
+          <w:tcPr>
+            <w:tcW w:type="dxa" w:w="440"/>
+            <w:tcBorders>
+              <w:top w:val="none" w:color="FFFFFF" w:sz="0"/>
+              <w:left w:val="none" w:color="FFFFFF" w:sz="0"/>
+              <w:bottom w:val="none" w:color="FFFFFF" w:sz="0"/>
+              <w:right w:val="none" w:color="FFFFFF" w:sz="0"/>
+            </w:tcBorders>
+            <w:shd w:fill="F0FAFA" w:color="auto" w:val="clear"/>
+            <w:tcMar>
+              <w:top w:type="dxa" w:w="40"/>
+              <w:left w:type="dxa" w:w="80"/>
+              <w:bottom w:type="dxa" w:w="40"/>
+              <w:right w:type="dxa" w:w="80"/>
+            </w:tcMar>
+            <w:vAlign w:val="center"/>
+          </w:tcPr>
+          <w:p>
+            <w:pPr>
+              <w:jc w:val="center"/>
+            </w:pPr>
+            <w:r>
+              <w:rPr>
+                <w:rFonts w:ascii="Arial" w:cs="Arial" w:eastAsia="Arial" w:hAnsi="Arial"/>
+                <w:color w:val="6B6B6B"/>
+                <w:sz w:val="15"/>
+                <w:szCs w:val="15"/>
+              </w:rPr>
+              <w:t xml:space="preserve">90s</w:t>
+            </w:r>
+          </w:p>
+        </w:tc>
+        <w:tc>
+          <w:tcPr>
+            <w:tcW w:type="dxa" w:w="5580"/>
+            <w:tcBorders>
+              <w:top w:val="none" w:color="FFFFFF" w:sz="0"/>
+              <w:left w:val="none" w:color="FFFFFF" w:sz="0"/>
+              <w:bottom w:val="none" w:color="FFFFFF" w:sz="0"/>
+              <w:right w:val="none" w:color="FFFFFF" w:sz="0"/>
+            </w:tcBorders>
+            <w:shd w:fill="F0FAFA" w:color="auto" w:val="clear"/>
+            <w:tcMar>
+              <w:top w:type="dxa" w:w="40"/>
+              <w:left w:type="dxa" w:w="80"/>
+              <w:bottom w:type="dxa" w:w="40"/>
+              <w:right w:type="dxa" w:w="80"/>
+            </w:tcMar>
+            <w:vAlign w:val="center"/>
+          </w:tcPr>
+          <w:p>
+            <w:r>
+              <w:rPr>
+                <w:rFonts w:ascii="Arial" w:cs="Arial" w:eastAsia="Arial" w:hAnsi="Arial"/>
+                <w:color w:val="6B6B6B"/>
+                <w:sz w:val="17"/>
+                <w:szCs w:val="17"/>
+              </w:rPr>
+              <w:t xml:space="preserve">Flat back, brace, push floor away evenly.</w:t>
+            </w:r>
+            <w:r>
+              <w:rPr>
+                <w:rFonts w:ascii="Arial" w:cs="Arial" w:eastAsia="Arial" w:hAnsi="Arial"/>
+                <w:i/>
+                <w:iCs/>
+                <w:color w:val="00695C"/>
+                <w:sz w:val="14"/>
+                <w:szCs w:val="14"/>
+              </w:rPr>
+              <w:t xml:space="preserve">  3+ RIR</w:t>
+            </w:r>
+          </w:p>
+        </w:tc>
+      </w:tr>
+    </w:tbl>
+    <w:p>
+      <w:pPr>
+        <w:spacing w:after="100"/>
+      </w:pPr>
+    </w:p>
+    <w:p>
+      <w:pPr>
+        <w:spacing w:after="60" w:before="120"/>
+      </w:pPr>
+      <w:r>
+        <w:rPr>
+          <w:rFonts w:ascii="Arial" w:cs="Arial" w:eastAsia="Arial" w:hAnsi="Arial"/>
+          <w:b/>
+          <w:bCs/>
+          <w:color w:val="C9A227"/>
+          <w:sz w:val="17"/>
+          <w:szCs w:val="17"/>
+        </w:rPr>
+        <w:t xml:space="preserve">E — FULL-BODY INTEGRATION — FARMERS CARRY (LIGHT)</w:t>
+      </w:r>
+    </w:p>
+    <w:p>
+      <w:pPr>
+        <w:spacing w:after="80"/>
+      </w:pPr>
+      <w:r>
+        <w:rPr>
+          <w:rFonts w:ascii="Arial" w:cs="Arial" w:eastAsia="Arial" w:hAnsi="Arial"/>
+          <w:b/>
+          <w:bCs/>
+          <w:color w:val="C9A227"/>
+          <w:sz w:val="17"/>
+          <w:szCs w:val="17"/>
+        </w:rPr>
+        <w:t xml:space="preserve">Why:  </w:t>
+      </w:r>
+      <w:r>
+        <w:rPr>
+          <w:rFonts w:ascii="Arial" w:cs="Arial" w:eastAsia="Arial" w:hAnsi="Arial"/>
+          <w:color w:val="2C2C2C"/>
+          <w:sz w:val="17"/>
+          <w:szCs w:val="17"/>
+        </w:rPr>
+        <w:t xml:space="preserve">The session's closing compound — a light loaded carry that puts today's two brand-new lift patterns to work as one integrated movement: the hinge to pick the weights up, the braced, tall posture of the squat work, carried under gait. Loads stay deliberately below her tested 30 lbs/hand carry baseline — this closes a technique day with quality movement, not extra load. Distance and movement quality govern this work, not an effort target. A goblet carry (one DB held at the chest) covers the same ground with an upright-posture bias if it suits the day better.</w:t>
+      </w:r>
+    </w:p>
+    <w:tbl>
+      <w:tblPr>
+        <w:tblW w:type="dxa" w:w="10440"/>
+        <w:tblBorders>
+          <w:top w:val="none" w:color="FFFFFF" w:sz="0"/>
+          <w:left w:val="none" w:color="FFFFFF" w:sz="0"/>
+          <w:bottom w:val="none" w:color="FFFFFF" w:sz="0"/>
+          <w:right w:val="none" w:color="FFFFFF" w:sz="0"/>
+          <w:insideH w:val="single" w:color="auto" w:sz="4"/>
+          <w:insideV w:val="single" w:color="auto" w:sz="4"/>
+        </w:tblBorders>
+      </w:tblPr>
+      <w:tblGrid>
+        <w:gridCol w:w="2400"/>
+        <w:gridCol w:w="380"/>
+        <w:gridCol w:w="420"/>
+        <w:gridCol w:w="680"/>
+        <w:gridCol w:w="540"/>
+        <w:gridCol w:w="440"/>
+        <w:gridCol w:w="5580"/>
+      </w:tblGrid>
+      <w:tr>
+        <w:tc>
+          <w:tcPr>
+            <w:tcW w:type="dxa" w:w="2400"/>
+            <w:tcBorders>
+              <w:top w:val="none" w:color="FFFFFF" w:sz="0"/>
+              <w:left w:val="none" w:color="FFFFFF" w:sz="0"/>
+              <w:bottom w:val="none" w:color="FFFFFF" w:sz="0"/>
+              <w:right w:val="none" w:color="FFFFFF" w:sz="0"/>
+            </w:tcBorders>
+            <w:shd w:fill="F5E8C0" w:color="auto" w:val="clear"/>
+            <w:tcMar>
+              <w:top w:type="dxa" w:w="40"/>
+              <w:left w:type="dxa" w:w="80"/>
+              <w:bottom w:type="dxa" w:w="40"/>
+              <w:right w:type="dxa" w:w="80"/>
+            </w:tcMar>
+            <w:vAlign w:val="center"/>
+          </w:tcPr>
+          <w:p>
+            <w:pPr>
+              <w:jc w:val="left"/>
+            </w:pPr>
+            <w:r>
+              <w:rPr>
+                <w:rFonts w:ascii="Arial" w:cs="Arial" w:eastAsia="Arial" w:hAnsi="Arial"/>
+                <w:b/>
+                <w:bCs/>
+                <w:color w:val="C9A227"/>
+                <w:sz w:val="15"/>
+                <w:szCs w:val="15"/>
+              </w:rPr>
+              <w:t xml:space="preserve">EXERCISE</w:t>
+            </w:r>
+          </w:p>
+        </w:tc>
+        <w:tc>
+          <w:tcPr>
+            <w:tcW w:type="dxa" w:w="380"/>
+            <w:tcBorders>
+              <w:top w:val="none" w:color="FFFFFF" w:sz="0"/>
+              <w:left w:val="none" w:color="FFFFFF" w:sz="0"/>
+              <w:bottom w:val="none" w:color="FFFFFF" w:sz="0"/>
+              <w:right w:val="none" w:color="FFFFFF" w:sz="0"/>
+            </w:tcBorders>
+            <w:shd w:fill="F5E8C0" w:color="auto" w:val="clear"/>
+            <w:tcMar>
+              <w:top w:type="dxa" w:w="40"/>
+              <w:left w:type="dxa" w:w="80"/>
+              <w:bottom w:type="dxa" w:w="40"/>
+              <w:right w:type="dxa" w:w="80"/>
+            </w:tcMar>
+            <w:vAlign w:val="center"/>
+          </w:tcPr>
+          <w:p>
+            <w:pPr>
+              <w:jc w:val="center"/>
+            </w:pPr>
+            <w:r>
+              <w:rPr>
+                <w:rFonts w:ascii="Arial" w:cs="Arial" w:eastAsia="Arial" w:hAnsi="Arial"/>
+                <w:b/>
+                <w:bCs/>
+                <w:color w:val="C9A227"/>
+                <w:sz w:val="13"/>
+                <w:szCs w:val="13"/>
+              </w:rPr>
+              <w:t xml:space="preserve">SETS</w:t>
+            </w:r>
+          </w:p>
+        </w:tc>
+        <w:tc>
+          <w:tcPr>
+            <w:tcW w:type="dxa" w:w="420"/>
+            <w:tcBorders>
+              <w:top w:val="none" w:color="FFFFFF" w:sz="0"/>
+              <w:left w:val="none" w:color="FFFFFF" w:sz="0"/>
+              <w:bottom w:val="none" w:color="FFFFFF" w:sz="0"/>
+              <w:right w:val="none" w:color="FFFFFF" w:sz="0"/>
+            </w:tcBorders>
+            <w:shd w:fill="F5E8C0" w:color="auto" w:val="clear"/>
+            <w:tcMar>
+              <w:top w:type="dxa" w:w="40"/>
+              <w:left w:type="dxa" w:w="80"/>
+              <w:bottom w:type="dxa" w:w="40"/>
+              <w:right w:type="dxa" w:w="80"/>
+            </w:tcMar>
+            <w:vAlign w:val="center"/>
+          </w:tcPr>
+          <w:p>
+            <w:pPr>
+              <w:jc w:val="center"/>
+            </w:pPr>
+            <w:r>
+              <w:rPr>
+                <w:rFonts w:ascii="Arial" w:cs="Arial" w:eastAsia="Arial" w:hAnsi="Arial"/>
+                <w:b/>
+                <w:bCs/>
+                <w:color w:val="C9A227"/>
+                <w:sz w:val="13"/>
+                <w:szCs w:val="13"/>
+              </w:rPr>
+              <w:t xml:space="preserve">REPS</w:t>
+            </w:r>
+          </w:p>
+        </w:tc>
+        <w:tc>
+          <w:tcPr>
+            <w:tcW w:type="dxa" w:w="680"/>
+            <w:tcBorders>
+              <w:top w:val="none" w:color="FFFFFF" w:sz="0"/>
+              <w:left w:val="none" w:color="FFFFFF" w:sz="0"/>
+              <w:bottom w:val="none" w:color="FFFFFF" w:sz="0"/>
+              <w:right w:val="none" w:color="FFFFFF" w:sz="0"/>
+            </w:tcBorders>
+            <w:shd w:fill="F5E8C0" w:color="auto" w:val="clear"/>
+            <w:tcMar>
+              <w:top w:type="dxa" w:w="40"/>
+              <w:left w:type="dxa" w:w="80"/>
+              <w:bottom w:type="dxa" w:w="40"/>
+              <w:right w:type="dxa" w:w="80"/>
+            </w:tcMar>
+            <w:vAlign w:val="center"/>
+          </w:tcPr>
+          <w:p>
+            <w:pPr>
+              <w:jc w:val="center"/>
+            </w:pPr>
+            <w:r>
+              <w:rPr>
+                <w:rFonts w:ascii="Arial" w:cs="Arial" w:eastAsia="Arial" w:hAnsi="Arial"/>
+                <w:b/>
+                <w:bCs/>
+                <w:color w:val="C9A227"/>
+                <w:sz w:val="13"/>
+                <w:szCs w:val="13"/>
+              </w:rPr>
+              <w:t xml:space="preserve">LOAD</w:t>
+            </w:r>
+          </w:p>
+        </w:tc>
+        <w:tc>
+          <w:tcPr>
+            <w:tcW w:type="dxa" w:w="540"/>
+            <w:tcBorders>
+              <w:top w:val="none" w:color="FFFFFF" w:sz="0"/>
+              <w:left w:val="none" w:color="FFFFFF" w:sz="0"/>
+              <w:bottom w:val="none" w:color="FFFFFF" w:sz="0"/>
+              <w:right w:val="none" w:color="FFFFFF" w:sz="0"/>
+            </w:tcBorders>
+            <w:shd w:fill="F5E8C0" w:color="auto" w:val="clear"/>
+            <w:tcMar>
+              <w:top w:type="dxa" w:w="40"/>
+              <w:left w:type="dxa" w:w="80"/>
+              <w:bottom w:type="dxa" w:w="40"/>
+              <w:right w:type="dxa" w:w="80"/>
+            </w:tcMar>
+            <w:vAlign w:val="center"/>
+          </w:tcPr>
+          <w:p>
+            <w:pPr>
+              <w:jc w:val="center"/>
+            </w:pPr>
+            <w:r>
+              <w:rPr>
+                <w:rFonts w:ascii="Arial" w:cs="Arial" w:eastAsia="Arial" w:hAnsi="Arial"/>
+                <w:b/>
+                <w:bCs/>
+                <w:color w:val="C9A227"/>
+                <w:sz w:val="13"/>
+                <w:szCs w:val="13"/>
+              </w:rPr>
+              <w:t xml:space="preserve">TEMPO</w:t>
+            </w:r>
+          </w:p>
+        </w:tc>
+        <w:tc>
+          <w:tcPr>
+            <w:tcW w:type="dxa" w:w="440"/>
+            <w:tcBorders>
+              <w:top w:val="none" w:color="FFFFFF" w:sz="0"/>
+              <w:left w:val="none" w:color="FFFFFF" w:sz="0"/>
+              <w:bottom w:val="none" w:color="FFFFFF" w:sz="0"/>
+              <w:right w:val="none" w:color="FFFFFF" w:sz="0"/>
+            </w:tcBorders>
+            <w:shd w:fill="F5E8C0" w:color="auto" w:val="clear"/>
+            <w:tcMar>
+              <w:top w:type="dxa" w:w="40"/>
+              <w:left w:type="dxa" w:w="80"/>
+              <w:bottom w:type="dxa" w:w="40"/>
+              <w:right w:type="dxa" w:w="80"/>
+            </w:tcMar>
+            <w:vAlign w:val="center"/>
+          </w:tcPr>
+          <w:p>
+            <w:pPr>
+              <w:jc w:val="center"/>
+            </w:pPr>
+            <w:r>
+              <w:rPr>
+                <w:rFonts w:ascii="Arial" w:cs="Arial" w:eastAsia="Arial" w:hAnsi="Arial"/>
+                <w:b/>
+                <w:bCs/>
+                <w:color w:val="C9A227"/>
+                <w:sz w:val="13"/>
+                <w:szCs w:val="13"/>
+              </w:rPr>
+              <w:t xml:space="preserve">REST</w:t>
+            </w:r>
+          </w:p>
+        </w:tc>
+        <w:tc>
+          <w:tcPr>
+            <w:tcW w:type="dxa" w:w="5580"/>
+            <w:tcBorders>
+              <w:top w:val="none" w:color="FFFFFF" w:sz="0"/>
+              <w:left w:val="none" w:color="FFFFFF" w:sz="0"/>
+              <w:bottom w:val="none" w:color="FFFFFF" w:sz="0"/>
+              <w:right w:val="none" w:color="FFFFFF" w:sz="0"/>
+            </w:tcBorders>
+            <w:shd w:fill="F5E8C0" w:color="auto" w:val="clear"/>
+            <w:tcMar>
+              <w:top w:type="dxa" w:w="40"/>
+              <w:left w:type="dxa" w:w="80"/>
+              <w:bottom w:type="dxa" w:w="40"/>
+              <w:right w:type="dxa" w:w="80"/>
+            </w:tcMar>
+            <w:vAlign w:val="center"/>
+          </w:tcPr>
+          <w:p>
+            <w:pPr>
+              <w:jc w:val="left"/>
+            </w:pPr>
+            <w:r>
+              <w:rPr>
+                <w:rFonts w:ascii="Arial" w:cs="Arial" w:eastAsia="Arial" w:hAnsi="Arial"/>
+                <w:b/>
+                <w:bCs/>
+                <w:color w:val="C9A227"/>
+                <w:sz w:val="15"/>
+                <w:szCs w:val="15"/>
+              </w:rPr>
+              <w:t xml:space="preserve">COACHING CUE</w:t>
+            </w:r>
+          </w:p>
+        </w:tc>
+      </w:tr>
+      <w:tr>
+        <w:tc>
+          <w:tcPr>
+            <w:tcW w:type="dxa" w:w="2400"/>
+            <w:tcBorders>
+              <w:top w:val="none" w:color="FFFFFF" w:sz="0"/>
+              <w:left w:val="none" w:color="FFFFFF" w:sz="0"/>
+              <w:bottom w:val="none" w:color="FFFFFF" w:sz="0"/>
+              <w:right w:val="none" w:color="FFFFFF" w:sz="0"/>
+            </w:tcBorders>
+            <w:shd w:fill="FAF3E0" w:color="auto" w:val="clear"/>
+            <w:tcMar>
+              <w:top w:type="dxa" w:w="40"/>
+              <w:left w:type="dxa" w:w="80"/>
+              <w:bottom w:type="dxa" w:w="40"/>
+              <w:right w:type="dxa" w:w="80"/>
+            </w:tcMar>
+            <w:vAlign w:val="center"/>
+          </w:tcPr>
+          <w:p>
+            <w:r>
+              <w:rPr>
+                <w:rFonts w:ascii="Arial" w:cs="Arial" w:eastAsia="Arial" w:hAnsi="Arial"/>
+                <w:b/>
+                <w:bCs/>
+                <w:color w:val="2C2C2C"/>
+                <w:sz w:val="18"/>
+                <w:szCs w:val="18"/>
+              </w:rPr>
+              <w:t xml:space="preserve">Farmers Carry (DB, Both Hands — Light)</w:t>
+            </w:r>
+          </w:p>
+        </w:tc>
+        <w:tc>
+          <w:tcPr>
+            <w:tcW w:type="dxa" w:w="380"/>
+            <w:tcBorders>
+              <w:top w:val="none" w:color="FFFFFF" w:sz="0"/>
+              <w:left w:val="none" w:color="FFFFFF" w:sz="0"/>
+              <w:bottom w:val="none" w:color="FFFFFF" w:sz="0"/>
+              <w:right w:val="none" w:color="FFFFFF" w:sz="0"/>
+            </w:tcBorders>
+            <w:shd w:fill="FAF3E0" w:color="auto" w:val="clear"/>
+            <w:tcMar>
+              <w:top w:type="dxa" w:w="40"/>
+              <w:left w:type="dxa" w:w="80"/>
+              <w:bottom w:type="dxa" w:w="40"/>
+              <w:right w:type="dxa" w:w="80"/>
+            </w:tcMar>
+            <w:vAlign w:val="center"/>
+          </w:tcPr>
+          <w:p>
+            <w:pPr>
+              <w:jc w:val="center"/>
+            </w:pPr>
+            <w:r>
+              <w:rPr>
+                <w:rFonts w:ascii="Arial" w:cs="Arial" w:eastAsia="Arial" w:hAnsi="Arial"/>
+                <w:color w:val="6B6B6B"/>
+                <w:sz w:val="15"/>
+                <w:szCs w:val="15"/>
+              </w:rPr>
+              <w:t xml:space="preserve">2</w:t>
+            </w:r>
+          </w:p>
+        </w:tc>
+        <w:tc>
+          <w:tcPr>
+            <w:tcW w:type="dxa" w:w="420"/>
+            <w:tcBorders>
+              <w:top w:val="none" w:color="FFFFFF" w:sz="0"/>
+              <w:left w:val="none" w:color="FFFFFF" w:sz="0"/>
+              <w:bottom w:val="none" w:color="FFFFFF" w:sz="0"/>
+              <w:right w:val="none" w:color="FFFFFF" w:sz="0"/>
+            </w:tcBorders>
+            <w:shd w:fill="FAF3E0" w:color="auto" w:val="clear"/>
+            <w:tcMar>
+              <w:top w:type="dxa" w:w="40"/>
+              <w:left w:type="dxa" w:w="80"/>
+              <w:bottom w:type="dxa" w:w="40"/>
+              <w:right w:type="dxa" w:w="80"/>
+            </w:tcMar>
+            <w:vAlign w:val="center"/>
+          </w:tcPr>
+          <w:p>
+            <w:pPr>
+              <w:jc w:val="center"/>
+            </w:pPr>
+            <w:r>
+              <w:rPr>
+                <w:rFonts w:ascii="Arial" w:cs="Arial" w:eastAsia="Arial" w:hAnsi="Arial"/>
+                <w:color w:val="6B6B6B"/>
+                <w:sz w:val="15"/>
+                <w:szCs w:val="15"/>
+              </w:rPr>
+              <w:t xml:space="preserve">25–30 yd</w:t>
+            </w:r>
+          </w:p>
+        </w:tc>
+        <w:tc>
+          <w:tcPr>
+            <w:tcW w:type="dxa" w:w="680"/>
+            <w:tcBorders>
+              <w:top w:val="none" w:color="FFFFFF" w:sz="0"/>
+              <w:left w:val="none" w:color="FFFFFF" w:sz="0"/>
+              <w:bottom w:val="none" w:color="FFFFFF" w:sz="0"/>
+              <w:right w:val="none" w:color="FFFFFF" w:sz="0"/>
+            </w:tcBorders>
+            <w:shd w:fill="FAF3E0" w:color="auto" w:val="clear"/>
+            <w:tcMar>
+              <w:top w:type="dxa" w:w="40"/>
+              <w:left w:type="dxa" w:w="80"/>
+              <w:bottom w:type="dxa" w:w="40"/>
+              <w:right w:type="dxa" w:w="80"/>
+            </w:tcMar>
+            <w:vAlign w:val="center"/>
+          </w:tcPr>
+          <w:p>
+            <w:pPr>
+              <w:jc w:val="center"/>
+            </w:pPr>
+            <w:r>
+              <w:rPr>
+                <w:rFonts w:ascii="Arial" w:cs="Arial" w:eastAsia="Arial" w:hAnsi="Arial"/>
+                <w:color w:val="6B6B6B"/>
+                <w:sz w:val="15"/>
+                <w:szCs w:val="15"/>
+              </w:rPr>
+              <w:t xml:space="preserve">20–25 lbs/hand</w:t>
+            </w:r>
+          </w:p>
+        </w:tc>
+        <w:tc>
+          <w:tcPr>
+            <w:tcW w:type="dxa" w:w="540"/>
+            <w:tcBorders>
+              <w:top w:val="none" w:color="FFFFFF" w:sz="0"/>
+              <w:left w:val="none" w:color="FFFFFF" w:sz="0"/>
+              <w:bottom w:val="none" w:color="FFFFFF" w:sz="0"/>
+              <w:right w:val="none" w:color="FFFFFF" w:sz="0"/>
+            </w:tcBorders>
+            <w:shd w:fill="FAF3E0" w:color="auto" w:val="clear"/>
+            <w:tcMar>
+              <w:top w:type="dxa" w:w="40"/>
+              <w:left w:type="dxa" w:w="80"/>
+              <w:bottom w:type="dxa" w:w="40"/>
+              <w:right w:type="dxa" w:w="80"/>
+            </w:tcMar>
+            <w:vAlign w:val="center"/>
+          </w:tcPr>
+          <w:p>
+            <w:pPr>
+              <w:jc w:val="center"/>
+            </w:pPr>
+            <w:r>
+              <w:rPr>
+                <w:rFonts w:ascii="Arial" w:cs="Arial" w:eastAsia="Arial" w:hAnsi="Arial"/>
+                <w:color w:val="6B6B6B"/>
+                <w:sz w:val="15"/>
+                <w:szCs w:val="15"/>
+              </w:rPr>
+              <w:t xml:space="preserve">controlled</w:t>
+            </w:r>
+          </w:p>
+        </w:tc>
+        <w:tc>
+          <w:tcPr>
+            <w:tcW w:type="dxa" w:w="440"/>
+            <w:tcBorders>
+              <w:top w:val="none" w:color="FFFFFF" w:sz="0"/>
+              <w:left w:val="none" w:color="FFFFFF" w:sz="0"/>
+              <w:bottom w:val="none" w:color="FFFFFF" w:sz="0"/>
+              <w:right w:val="none" w:color="FFFFFF" w:sz="0"/>
+            </w:tcBorders>
+            <w:shd w:fill="FAF3E0" w:color="auto" w:val="clear"/>
+            <w:tcMar>
+              <w:top w:type="dxa" w:w="40"/>
+              <w:left w:type="dxa" w:w="80"/>
+              <w:bottom w:type="dxa" w:w="40"/>
+              <w:right w:type="dxa" w:w="80"/>
+            </w:tcMar>
+            <w:vAlign w:val="center"/>
+          </w:tcPr>
+          <w:p>
+            <w:pPr>
+              <w:jc w:val="center"/>
+            </w:pPr>
+            <w:r>
+              <w:rPr>
+                <w:rFonts w:ascii="Arial" w:cs="Arial" w:eastAsia="Arial" w:hAnsi="Arial"/>
+                <w:color w:val="6B6B6B"/>
+                <w:sz w:val="15"/>
+                <w:szCs w:val="15"/>
+              </w:rPr>
+              <w:t xml:space="preserve">60s</w:t>
+            </w:r>
+          </w:p>
+        </w:tc>
+        <w:tc>
+          <w:tcPr>
+            <w:tcW w:type="dxa" w:w="5580"/>
+            <w:tcBorders>
+              <w:top w:val="none" w:color="FFFFFF" w:sz="0"/>
+              <w:left w:val="none" w:color="FFFFFF" w:sz="0"/>
+              <w:bottom w:val="none" w:color="FFFFFF" w:sz="0"/>
+              <w:right w:val="none" w:color="FFFFFF" w:sz="0"/>
+            </w:tcBorders>
+            <w:shd w:fill="FAF3E0" w:color="auto" w:val="clear"/>
+            <w:tcMar>
+              <w:top w:type="dxa" w:w="40"/>
+              <w:left w:type="dxa" w:w="80"/>
+              <w:bottom w:type="dxa" w:w="40"/>
+              <w:right w:type="dxa" w:w="80"/>
+            </w:tcMar>
+            <w:vAlign w:val="center"/>
+          </w:tcPr>
+          <w:p>
+            <w:r>
+              <w:rPr>
+                <w:rFonts w:ascii="Arial" w:cs="Arial" w:eastAsia="Arial" w:hAnsi="Arial"/>
+                <w:color w:val="6B6B6B"/>
+                <w:sz w:val="17"/>
+                <w:szCs w:val="17"/>
+              </w:rPr>
+              <w:t xml:space="preserve">Hinge to pick up clean. Tall posture, ribs down, quick tight steps.</w:t>
+            </w:r>
+            <w:r>
+              <w:rPr>
+                <w:rFonts w:ascii="Arial" w:cs="Arial" w:eastAsia="Arial" w:hAnsi="Arial"/>
+                <w:i/>
+                <w:iCs/>
+                <w:color w:val="00695C"/>
+                <w:sz w:val="14"/>
+                <w:szCs w:val="14"/>
+              </w:rPr>
+              <w:t xml:space="preserve">  Distance &amp; quality governed — no RIR target</w:t>
+            </w:r>
+          </w:p>
+        </w:tc>
+      </w:tr>
+    </w:tbl>
+    <w:p>
+      <w:pPr>
+        <w:spacing w:after="100"/>
+      </w:pPr>
+    </w:p>
+    <w:p>
+      <w:pPr>
+        <w:spacing w:after="60" w:before="120"/>
+      </w:pPr>
+      <w:r>
+        <w:rPr>
+          <w:rFonts w:ascii="Arial" w:cs="Arial" w:eastAsia="Arial" w:hAnsi="Arial"/>
+          <w:b/>
+          <w:bCs/>
+          <w:color w:val="00695C"/>
+          <w:sz w:val="17"/>
+          <w:szCs w:val="17"/>
+        </w:rPr>
+        <w:t xml:space="preserve">F — METABOLIC FINISHER</w:t>
       </w:r>
     </w:p>
     <w:p>
@@ -8511,7 +9431,7 @@
           <w:sz w:val="17"/>
           <w:szCs w:val="17"/>
         </w:rPr>
-        <w:t xml:space="preserve">B — PRIMARY PRESS STRENGTH</w:t>
+        <w:t xml:space="preserve">B — PRIMARY COMPOUND — SEATED OVERHEAD PRESS</w:t>
       </w:r>
     </w:p>
     <w:p>
@@ -8536,7 +9456,7 @@
           <w:sz w:val="17"/>
           <w:szCs w:val="17"/>
         </w:rPr>
-        <w:t xml:space="preserve">Seated overhead press tested at 15 lbs x8 (Epley 1RM ≈19 lbs). Given the frozen shoulder history, Week 1 trains conservatively below baseline (12.5 lbs) and progresses only as far as pain-free range allows, reaching 17.5 lbs by Week 4.</w:t>
+        <w:t xml:space="preserve">The day's main lift. Seated overhead press tested at 15 lbs x8 (Epley 1RM ≈19 lbs). Given the frozen shoulder history, Week 1 trains conservatively below baseline (12.5 lbs) and progresses only as far as pain-free range allows, reaching 17.5 lbs by Week 4. If the day calls for a press variation, rotate between: a landmine press (a friendlier, angled arc when the fully vertical line isn't comfortable) or a half-kneeling single-arm DB press (light, one side at a time). Every option lives inside the same rule as the press itself — pain-free range only, sharp or pinching pain ends the set — and the seated press stays the lift we track and retest.</w:t>
       </w:r>
     </w:p>
     <w:tbl>
@@ -9060,6 +9980,74 @@
           </w:p>
         </w:tc>
       </w:tr>
+    </w:tbl>
+    <w:p>
+      <w:pPr>
+        <w:spacing w:after="100"/>
+      </w:pPr>
+    </w:p>
+    <w:p>
+      <w:pPr>
+        <w:spacing w:after="60" w:before="120"/>
+      </w:pPr>
+      <w:r>
+        <w:rPr>
+          <w:rFonts w:ascii="Arial" w:cs="Arial" w:eastAsia="Arial" w:hAnsi="Arial"/>
+          <w:b/>
+          <w:bCs/>
+          <w:color w:val="43A047"/>
+          <w:sz w:val="17"/>
+          <w:szCs w:val="17"/>
+        </w:rPr>
+        <w:t xml:space="preserve">C — ACCESSORY — INCLINE PUSH-UP</w:t>
+      </w:r>
+    </w:p>
+    <w:p>
+      <w:pPr>
+        <w:spacing w:after="80"/>
+      </w:pPr>
+      <w:r>
+        <w:rPr>
+          <w:rFonts w:ascii="Arial" w:cs="Arial" w:eastAsia="Arial" w:hAnsi="Arial"/>
+          <w:b/>
+          <w:bCs/>
+          <w:color w:val="43A047"/>
+          <w:sz w:val="17"/>
+          <w:szCs w:val="17"/>
+        </w:rPr>
+        <w:t xml:space="preserve">Load Target:  </w:t>
+      </w:r>
+      <w:r>
+        <w:rPr>
+          <w:rFonts w:ascii="Arial" w:cs="Arial" w:eastAsia="Arial" w:hAnsi="Arial"/>
+          <w:color w:val="2C2C2C"/>
+          <w:sz w:val="17"/>
+          <w:szCs w:val="17"/>
+        </w:rPr>
+        <w:t xml:space="preserve">The pressing accessory directly behind the overhead work — a controlled, non-overhead range that builds pushing volume while staying well clear of the shoulder's sensitive arc.</w:t>
+      </w:r>
+    </w:p>
+    <w:tbl>
+      <w:tblPr>
+        <w:tblW w:type="dxa" w:w="10440"/>
+        <w:tblBorders>
+          <w:top w:val="none" w:color="FFFFFF" w:sz="0"/>
+          <w:left w:val="none" w:color="FFFFFF" w:sz="0"/>
+          <w:bottom w:val="none" w:color="FFFFFF" w:sz="0"/>
+          <w:right w:val="none" w:color="FFFFFF" w:sz="0"/>
+          <w:insideH w:val="single" w:color="auto" w:sz="4"/>
+          <w:insideV w:val="single" w:color="auto" w:sz="4"/>
+        </w:tblBorders>
+      </w:tblPr>
+      <w:tblGrid>
+        <w:gridCol w:w="2400"/>
+        <w:gridCol w:w="380"/>
+        <w:gridCol w:w="420"/>
+        <w:gridCol w:w="680"/>
+        <w:gridCol w:w="540"/>
+        <w:gridCol w:w="440"/>
+        <w:gridCol w:w="5580"/>
+      </w:tblGrid>
       <w:tr>
         <w:tc>
           <w:tcPr>
@@ -9070,7 +10058,254 @@
               <w:bottom w:val="none" w:color="FFFFFF" w:sz="0"/>
               <w:right w:val="none" w:color="FFFFFF" w:sz="0"/>
             </w:tcBorders>
-            <w:shd w:fill="FFFFFF" w:color="auto" w:val="clear"/>
+            <w:shd w:fill="E8F5E9" w:color="auto" w:val="clear"/>
+            <w:tcMar>
+              <w:top w:type="dxa" w:w="40"/>
+              <w:left w:type="dxa" w:w="80"/>
+              <w:bottom w:type="dxa" w:w="40"/>
+              <w:right w:type="dxa" w:w="80"/>
+            </w:tcMar>
+            <w:vAlign w:val="center"/>
+          </w:tcPr>
+          <w:p>
+            <w:pPr>
+              <w:jc w:val="left"/>
+            </w:pPr>
+            <w:r>
+              <w:rPr>
+                <w:rFonts w:ascii="Arial" w:cs="Arial" w:eastAsia="Arial" w:hAnsi="Arial"/>
+                <w:b/>
+                <w:bCs/>
+                <w:color w:val="43A047"/>
+                <w:sz w:val="15"/>
+                <w:szCs w:val="15"/>
+              </w:rPr>
+              <w:t xml:space="preserve">EXERCISE</w:t>
+            </w:r>
+          </w:p>
+        </w:tc>
+        <w:tc>
+          <w:tcPr>
+            <w:tcW w:type="dxa" w:w="380"/>
+            <w:tcBorders>
+              <w:top w:val="none" w:color="FFFFFF" w:sz="0"/>
+              <w:left w:val="none" w:color="FFFFFF" w:sz="0"/>
+              <w:bottom w:val="none" w:color="FFFFFF" w:sz="0"/>
+              <w:right w:val="none" w:color="FFFFFF" w:sz="0"/>
+            </w:tcBorders>
+            <w:shd w:fill="E8F5E9" w:color="auto" w:val="clear"/>
+            <w:tcMar>
+              <w:top w:type="dxa" w:w="40"/>
+              <w:left w:type="dxa" w:w="80"/>
+              <w:bottom w:type="dxa" w:w="40"/>
+              <w:right w:type="dxa" w:w="80"/>
+            </w:tcMar>
+            <w:vAlign w:val="center"/>
+          </w:tcPr>
+          <w:p>
+            <w:pPr>
+              <w:jc w:val="center"/>
+            </w:pPr>
+            <w:r>
+              <w:rPr>
+                <w:rFonts w:ascii="Arial" w:cs="Arial" w:eastAsia="Arial" w:hAnsi="Arial"/>
+                <w:b/>
+                <w:bCs/>
+                <w:color w:val="43A047"/>
+                <w:sz w:val="13"/>
+                <w:szCs w:val="13"/>
+              </w:rPr>
+              <w:t xml:space="preserve">SETS</w:t>
+            </w:r>
+          </w:p>
+        </w:tc>
+        <w:tc>
+          <w:tcPr>
+            <w:tcW w:type="dxa" w:w="420"/>
+            <w:tcBorders>
+              <w:top w:val="none" w:color="FFFFFF" w:sz="0"/>
+              <w:left w:val="none" w:color="FFFFFF" w:sz="0"/>
+              <w:bottom w:val="none" w:color="FFFFFF" w:sz="0"/>
+              <w:right w:val="none" w:color="FFFFFF" w:sz="0"/>
+            </w:tcBorders>
+            <w:shd w:fill="E8F5E9" w:color="auto" w:val="clear"/>
+            <w:tcMar>
+              <w:top w:type="dxa" w:w="40"/>
+              <w:left w:type="dxa" w:w="80"/>
+              <w:bottom w:type="dxa" w:w="40"/>
+              <w:right w:type="dxa" w:w="80"/>
+            </w:tcMar>
+            <w:vAlign w:val="center"/>
+          </w:tcPr>
+          <w:p>
+            <w:pPr>
+              <w:jc w:val="center"/>
+            </w:pPr>
+            <w:r>
+              <w:rPr>
+                <w:rFonts w:ascii="Arial" w:cs="Arial" w:eastAsia="Arial" w:hAnsi="Arial"/>
+                <w:b/>
+                <w:bCs/>
+                <w:color w:val="43A047"/>
+                <w:sz w:val="13"/>
+                <w:szCs w:val="13"/>
+              </w:rPr>
+              <w:t xml:space="preserve">REPS</w:t>
+            </w:r>
+          </w:p>
+        </w:tc>
+        <w:tc>
+          <w:tcPr>
+            <w:tcW w:type="dxa" w:w="680"/>
+            <w:tcBorders>
+              <w:top w:val="none" w:color="FFFFFF" w:sz="0"/>
+              <w:left w:val="none" w:color="FFFFFF" w:sz="0"/>
+              <w:bottom w:val="none" w:color="FFFFFF" w:sz="0"/>
+              <w:right w:val="none" w:color="FFFFFF" w:sz="0"/>
+            </w:tcBorders>
+            <w:shd w:fill="E8F5E9" w:color="auto" w:val="clear"/>
+            <w:tcMar>
+              <w:top w:type="dxa" w:w="40"/>
+              <w:left w:type="dxa" w:w="80"/>
+              <w:bottom w:type="dxa" w:w="40"/>
+              <w:right w:type="dxa" w:w="80"/>
+            </w:tcMar>
+            <w:vAlign w:val="center"/>
+          </w:tcPr>
+          <w:p>
+            <w:pPr>
+              <w:jc w:val="center"/>
+            </w:pPr>
+            <w:r>
+              <w:rPr>
+                <w:rFonts w:ascii="Arial" w:cs="Arial" w:eastAsia="Arial" w:hAnsi="Arial"/>
+                <w:b/>
+                <w:bCs/>
+                <w:color w:val="43A047"/>
+                <w:sz w:val="13"/>
+                <w:szCs w:val="13"/>
+              </w:rPr>
+              <w:t xml:space="preserve">LOAD</w:t>
+            </w:r>
+          </w:p>
+        </w:tc>
+        <w:tc>
+          <w:tcPr>
+            <w:tcW w:type="dxa" w:w="540"/>
+            <w:tcBorders>
+              <w:top w:val="none" w:color="FFFFFF" w:sz="0"/>
+              <w:left w:val="none" w:color="FFFFFF" w:sz="0"/>
+              <w:bottom w:val="none" w:color="FFFFFF" w:sz="0"/>
+              <w:right w:val="none" w:color="FFFFFF" w:sz="0"/>
+            </w:tcBorders>
+            <w:shd w:fill="E8F5E9" w:color="auto" w:val="clear"/>
+            <w:tcMar>
+              <w:top w:type="dxa" w:w="40"/>
+              <w:left w:type="dxa" w:w="80"/>
+              <w:bottom w:type="dxa" w:w="40"/>
+              <w:right w:type="dxa" w:w="80"/>
+            </w:tcMar>
+            <w:vAlign w:val="center"/>
+          </w:tcPr>
+          <w:p>
+            <w:pPr>
+              <w:jc w:val="center"/>
+            </w:pPr>
+            <w:r>
+              <w:rPr>
+                <w:rFonts w:ascii="Arial" w:cs="Arial" w:eastAsia="Arial" w:hAnsi="Arial"/>
+                <w:b/>
+                <w:bCs/>
+                <w:color w:val="43A047"/>
+                <w:sz w:val="13"/>
+                <w:szCs w:val="13"/>
+              </w:rPr>
+              <w:t xml:space="preserve">TEMPO</w:t>
+            </w:r>
+          </w:p>
+        </w:tc>
+        <w:tc>
+          <w:tcPr>
+            <w:tcW w:type="dxa" w:w="440"/>
+            <w:tcBorders>
+              <w:top w:val="none" w:color="FFFFFF" w:sz="0"/>
+              <w:left w:val="none" w:color="FFFFFF" w:sz="0"/>
+              <w:bottom w:val="none" w:color="FFFFFF" w:sz="0"/>
+              <w:right w:val="none" w:color="FFFFFF" w:sz="0"/>
+            </w:tcBorders>
+            <w:shd w:fill="E8F5E9" w:color="auto" w:val="clear"/>
+            <w:tcMar>
+              <w:top w:type="dxa" w:w="40"/>
+              <w:left w:type="dxa" w:w="80"/>
+              <w:bottom w:type="dxa" w:w="40"/>
+              <w:right w:type="dxa" w:w="80"/>
+            </w:tcMar>
+            <w:vAlign w:val="center"/>
+          </w:tcPr>
+          <w:p>
+            <w:pPr>
+              <w:jc w:val="center"/>
+            </w:pPr>
+            <w:r>
+              <w:rPr>
+                <w:rFonts w:ascii="Arial" w:cs="Arial" w:eastAsia="Arial" w:hAnsi="Arial"/>
+                <w:b/>
+                <w:bCs/>
+                <w:color w:val="43A047"/>
+                <w:sz w:val="13"/>
+                <w:szCs w:val="13"/>
+              </w:rPr>
+              <w:t xml:space="preserve">REST</w:t>
+            </w:r>
+          </w:p>
+        </w:tc>
+        <w:tc>
+          <w:tcPr>
+            <w:tcW w:type="dxa" w:w="5580"/>
+            <w:tcBorders>
+              <w:top w:val="none" w:color="FFFFFF" w:sz="0"/>
+              <w:left w:val="none" w:color="FFFFFF" w:sz="0"/>
+              <w:bottom w:val="none" w:color="FFFFFF" w:sz="0"/>
+              <w:right w:val="none" w:color="FFFFFF" w:sz="0"/>
+            </w:tcBorders>
+            <w:shd w:fill="E8F5E9" w:color="auto" w:val="clear"/>
+            <w:tcMar>
+              <w:top w:type="dxa" w:w="40"/>
+              <w:left w:type="dxa" w:w="80"/>
+              <w:bottom w:type="dxa" w:w="40"/>
+              <w:right w:type="dxa" w:w="80"/>
+            </w:tcMar>
+            <w:vAlign w:val="center"/>
+          </w:tcPr>
+          <w:p>
+            <w:pPr>
+              <w:jc w:val="left"/>
+            </w:pPr>
+            <w:r>
+              <w:rPr>
+                <w:rFonts w:ascii="Arial" w:cs="Arial" w:eastAsia="Arial" w:hAnsi="Arial"/>
+                <w:b/>
+                <w:bCs/>
+                <w:color w:val="43A047"/>
+                <w:sz w:val="15"/>
+                <w:szCs w:val="15"/>
+              </w:rPr>
+              <w:t xml:space="preserve">COACHING CUE</w:t>
+            </w:r>
+          </w:p>
+        </w:tc>
+      </w:tr>
+      <w:tr>
+        <w:tc>
+          <w:tcPr>
+            <w:tcW w:type="dxa" w:w="2400"/>
+            <w:tcBorders>
+              <w:top w:val="none" w:color="FFFFFF" w:sz="0"/>
+              <w:left w:val="none" w:color="FFFFFF" w:sz="0"/>
+              <w:bottom w:val="none" w:color="FFFFFF" w:sz="0"/>
+              <w:right w:val="none" w:color="FFFFFF" w:sz="0"/>
+            </w:tcBorders>
+            <w:shd w:fill="F1F8F2" w:color="auto" w:val="clear"/>
             <w:tcMar>
               <w:top w:type="dxa" w:w="40"/>
               <w:left w:type="dxa" w:w="80"/>
@@ -9102,7 +10337,7 @@
               <w:bottom w:val="none" w:color="FFFFFF" w:sz="0"/>
               <w:right w:val="none" w:color="FFFFFF" w:sz="0"/>
             </w:tcBorders>
-            <w:shd w:fill="FFFFFF" w:color="auto" w:val="clear"/>
+            <w:shd w:fill="F1F8F2" w:color="auto" w:val="clear"/>
             <w:tcMar>
               <w:top w:type="dxa" w:w="40"/>
               <w:left w:type="dxa" w:w="80"/>
@@ -9135,7 +10370,7 @@
               <w:bottom w:val="none" w:color="FFFFFF" w:sz="0"/>
               <w:right w:val="none" w:color="FFFFFF" w:sz="0"/>
             </w:tcBorders>
-            <w:shd w:fill="FFFFFF" w:color="auto" w:val="clear"/>
+            <w:shd w:fill="F1F8F2" w:color="auto" w:val="clear"/>
             <w:tcMar>
               <w:top w:type="dxa" w:w="40"/>
               <w:left w:type="dxa" w:w="80"/>
@@ -9168,7 +10403,7 @@
               <w:bottom w:val="none" w:color="FFFFFF" w:sz="0"/>
               <w:right w:val="none" w:color="FFFFFF" w:sz="0"/>
             </w:tcBorders>
-            <w:shd w:fill="FFFFFF" w:color="auto" w:val="clear"/>
+            <w:shd w:fill="F1F8F2" w:color="auto" w:val="clear"/>
             <w:tcMar>
               <w:top w:type="dxa" w:w="40"/>
               <w:left w:type="dxa" w:w="80"/>
@@ -9201,7 +10436,7 @@
               <w:bottom w:val="none" w:color="FFFFFF" w:sz="0"/>
               <w:right w:val="none" w:color="FFFFFF" w:sz="0"/>
             </w:tcBorders>
-            <w:shd w:fill="FFFFFF" w:color="auto" w:val="clear"/>
+            <w:shd w:fill="F1F8F2" w:color="auto" w:val="clear"/>
             <w:tcMar>
               <w:top w:type="dxa" w:w="40"/>
               <w:left w:type="dxa" w:w="80"/>
@@ -9234,7 +10469,7 @@
               <w:bottom w:val="none" w:color="FFFFFF" w:sz="0"/>
               <w:right w:val="none" w:color="FFFFFF" w:sz="0"/>
             </w:tcBorders>
-            <w:shd w:fill="FFFFFF" w:color="auto" w:val="clear"/>
+            <w:shd w:fill="F1F8F2" w:color="auto" w:val="clear"/>
             <w:tcMar>
               <w:top w:type="dxa" w:w="40"/>
               <w:left w:type="dxa" w:w="80"/>
@@ -9267,7 +10502,7 @@
               <w:bottom w:val="none" w:color="FFFFFF" w:sz="0"/>
               <w:right w:val="none" w:color="FFFFFF" w:sz="0"/>
             </w:tcBorders>
-            <w:shd w:fill="FFFFFF" w:color="auto" w:val="clear"/>
+            <w:shd w:fill="F1F8F2" w:color="auto" w:val="clear"/>
             <w:tcMar>
               <w:top w:type="dxa" w:w="40"/>
               <w:left w:type="dxa" w:w="80"/>
@@ -9319,7 +10554,7 @@
           <w:sz w:val="17"/>
           <w:szCs w:val="17"/>
         </w:rPr>
-        <w:t xml:space="preserve">C — PULL STRENGTH &amp; INCLINE PRESS BASELINE</w:t>
+        <w:t xml:space="preserve">D — SECONDARY COMPOUND — PULL STRENGTH &amp; INCLINE PRESS BASELINE</w:t>
       </w:r>
     </w:p>
     <w:p>
@@ -9344,7 +10579,7 @@
           <w:sz w:val="17"/>
           <w:szCs w:val="17"/>
         </w:rPr>
-        <w:t xml:space="preserve">Rowing volume balances the pressing work above and builds scapular stability around the healing shoulder. Incline Dumbbell Press was not part of the initial testing battery — it closes the block as a new horizontal-press baseline, light load and technique-first, respecting the same pain-free-range guardrail as the rest of this session.</w:t>
+        <w:t xml:space="preserve">The day's second compound territory — pulling, rotating off the pressing work above. Rowing volume balances the pressing and builds scapular stability around the healing shoulder. Incline Dumbbell Press was not part of the initial testing battery — it closes the block as a new horizontal-press baseline, light load and technique-first, respecting the same pain-free-range guardrail as the rest of this session. If the row needs a variation: a chest-supported DB row (torso fully supported) or a single-arm Kieser row covers the same pattern; the bent-over row stays the one we track.</w:t>
       </w:r>
     </w:p>
     <w:tbl>
@@ -9884,7 +11119,7 @@
                 <w:sz w:val="18"/>
                 <w:szCs w:val="18"/>
               </w:rPr>
-              <w:t xml:space="preserve">Face Pull (Band or Cable)</w:t>
+              <w:t xml:space="preserve">Face Pull (Band or Kieser)</w:t>
             </w:r>
           </w:p>
         </w:tc>
@@ -10356,7 +11591,562 @@
           <w:sz w:val="17"/>
           <w:szCs w:val="17"/>
         </w:rPr>
-        <w:t xml:space="preserve">D — METABOLIC FINISHER</w:t>
+        <w:t xml:space="preserve">E — FULL-BODY INTEGRATION — FARMERS CARRY (PACKED SHOULDERS)</w:t>
+      </w:r>
+    </w:p>
+    <w:p>
+      <w:pPr>
+        <w:spacing w:after="80"/>
+      </w:pPr>
+      <w:r>
+        <w:rPr>
+          <w:rFonts w:ascii="Arial" w:cs="Arial" w:eastAsia="Arial" w:hAnsi="Arial"/>
+          <w:b/>
+          <w:bCs/>
+          <w:color w:val="C9A227"/>
+          <w:sz w:val="17"/>
+          <w:szCs w:val="17"/>
+        </w:rPr>
+        <w:t xml:space="preserve">Why:  </w:t>
+      </w:r>
+      <w:r>
+        <w:rPr>
+          <w:rFonts w:ascii="Arial" w:cs="Arial" w:eastAsia="Arial" w:hAnsi="Arial"/>
+          <w:color w:val="2C2C2C"/>
+          <w:sz w:val="17"/>
+          <w:szCs w:val="17"/>
+        </w:rPr>
+        <w:t xml:space="preserve">The session's closing compound — a loaded carry that puts today's shoulder work to use in the position it is strongest and safest: shoulders packed down and back, arms locked at the sides, load carried under a tall, braced posture. This directly reinforces the shoulder-care priority in a closed, neutral position — nothing travels overhead. Loads stay below her tested 30 lbs/hand carry baseline. Distance and movement quality govern this work, not an effort target. A goblet carry (one DB at the chest) is the alternate if it suits the day better; no overhead carry variation is used in this program.</w:t>
+      </w:r>
+    </w:p>
+    <w:tbl>
+      <w:tblPr>
+        <w:tblW w:type="dxa" w:w="10440"/>
+        <w:tblBorders>
+          <w:top w:val="none" w:color="FFFFFF" w:sz="0"/>
+          <w:left w:val="none" w:color="FFFFFF" w:sz="0"/>
+          <w:bottom w:val="none" w:color="FFFFFF" w:sz="0"/>
+          <w:right w:val="none" w:color="FFFFFF" w:sz="0"/>
+          <w:insideH w:val="single" w:color="auto" w:sz="4"/>
+          <w:insideV w:val="single" w:color="auto" w:sz="4"/>
+        </w:tblBorders>
+      </w:tblPr>
+      <w:tblGrid>
+        <w:gridCol w:w="2400"/>
+        <w:gridCol w:w="380"/>
+        <w:gridCol w:w="420"/>
+        <w:gridCol w:w="680"/>
+        <w:gridCol w:w="540"/>
+        <w:gridCol w:w="440"/>
+        <w:gridCol w:w="5580"/>
+      </w:tblGrid>
+      <w:tr>
+        <w:tc>
+          <w:tcPr>
+            <w:tcW w:type="dxa" w:w="2400"/>
+            <w:tcBorders>
+              <w:top w:val="none" w:color="FFFFFF" w:sz="0"/>
+              <w:left w:val="none" w:color="FFFFFF" w:sz="0"/>
+              <w:bottom w:val="none" w:color="FFFFFF" w:sz="0"/>
+              <w:right w:val="none" w:color="FFFFFF" w:sz="0"/>
+            </w:tcBorders>
+            <w:shd w:fill="F5E8C0" w:color="auto" w:val="clear"/>
+            <w:tcMar>
+              <w:top w:type="dxa" w:w="40"/>
+              <w:left w:type="dxa" w:w="80"/>
+              <w:bottom w:type="dxa" w:w="40"/>
+              <w:right w:type="dxa" w:w="80"/>
+            </w:tcMar>
+            <w:vAlign w:val="center"/>
+          </w:tcPr>
+          <w:p>
+            <w:pPr>
+              <w:jc w:val="left"/>
+            </w:pPr>
+            <w:r>
+              <w:rPr>
+                <w:rFonts w:ascii="Arial" w:cs="Arial" w:eastAsia="Arial" w:hAnsi="Arial"/>
+                <w:b/>
+                <w:bCs/>
+                <w:color w:val="C9A227"/>
+                <w:sz w:val="15"/>
+                <w:szCs w:val="15"/>
+              </w:rPr>
+              <w:t xml:space="preserve">EXERCISE</w:t>
+            </w:r>
+          </w:p>
+        </w:tc>
+        <w:tc>
+          <w:tcPr>
+            <w:tcW w:type="dxa" w:w="380"/>
+            <w:tcBorders>
+              <w:top w:val="none" w:color="FFFFFF" w:sz="0"/>
+              <w:left w:val="none" w:color="FFFFFF" w:sz="0"/>
+              <w:bottom w:val="none" w:color="FFFFFF" w:sz="0"/>
+              <w:right w:val="none" w:color="FFFFFF" w:sz="0"/>
+            </w:tcBorders>
+            <w:shd w:fill="F5E8C0" w:color="auto" w:val="clear"/>
+            <w:tcMar>
+              <w:top w:type="dxa" w:w="40"/>
+              <w:left w:type="dxa" w:w="80"/>
+              <w:bottom w:type="dxa" w:w="40"/>
+              <w:right w:type="dxa" w:w="80"/>
+            </w:tcMar>
+            <w:vAlign w:val="center"/>
+          </w:tcPr>
+          <w:p>
+            <w:pPr>
+              <w:jc w:val="center"/>
+            </w:pPr>
+            <w:r>
+              <w:rPr>
+                <w:rFonts w:ascii="Arial" w:cs="Arial" w:eastAsia="Arial" w:hAnsi="Arial"/>
+                <w:b/>
+                <w:bCs/>
+                <w:color w:val="C9A227"/>
+                <w:sz w:val="13"/>
+                <w:szCs w:val="13"/>
+              </w:rPr>
+              <w:t xml:space="preserve">SETS</w:t>
+            </w:r>
+          </w:p>
+        </w:tc>
+        <w:tc>
+          <w:tcPr>
+            <w:tcW w:type="dxa" w:w="420"/>
+            <w:tcBorders>
+              <w:top w:val="none" w:color="FFFFFF" w:sz="0"/>
+              <w:left w:val="none" w:color="FFFFFF" w:sz="0"/>
+              <w:bottom w:val="none" w:color="FFFFFF" w:sz="0"/>
+              <w:right w:val="none" w:color="FFFFFF" w:sz="0"/>
+            </w:tcBorders>
+            <w:shd w:fill="F5E8C0" w:color="auto" w:val="clear"/>
+            <w:tcMar>
+              <w:top w:type="dxa" w:w="40"/>
+              <w:left w:type="dxa" w:w="80"/>
+              <w:bottom w:type="dxa" w:w="40"/>
+              <w:right w:type="dxa" w:w="80"/>
+            </w:tcMar>
+            <w:vAlign w:val="center"/>
+          </w:tcPr>
+          <w:p>
+            <w:pPr>
+              <w:jc w:val="center"/>
+            </w:pPr>
+            <w:r>
+              <w:rPr>
+                <w:rFonts w:ascii="Arial" w:cs="Arial" w:eastAsia="Arial" w:hAnsi="Arial"/>
+                <w:b/>
+                <w:bCs/>
+                <w:color w:val="C9A227"/>
+                <w:sz w:val="13"/>
+                <w:szCs w:val="13"/>
+              </w:rPr>
+              <w:t xml:space="preserve">REPS</w:t>
+            </w:r>
+          </w:p>
+        </w:tc>
+        <w:tc>
+          <w:tcPr>
+            <w:tcW w:type="dxa" w:w="680"/>
+            <w:tcBorders>
+              <w:top w:val="none" w:color="FFFFFF" w:sz="0"/>
+              <w:left w:val="none" w:color="FFFFFF" w:sz="0"/>
+              <w:bottom w:val="none" w:color="FFFFFF" w:sz="0"/>
+              <w:right w:val="none" w:color="FFFFFF" w:sz="0"/>
+            </w:tcBorders>
+            <w:shd w:fill="F5E8C0" w:color="auto" w:val="clear"/>
+            <w:tcMar>
+              <w:top w:type="dxa" w:w="40"/>
+              <w:left w:type="dxa" w:w="80"/>
+              <w:bottom w:type="dxa" w:w="40"/>
+              <w:right w:type="dxa" w:w="80"/>
+            </w:tcMar>
+            <w:vAlign w:val="center"/>
+          </w:tcPr>
+          <w:p>
+            <w:pPr>
+              <w:jc w:val="center"/>
+            </w:pPr>
+            <w:r>
+              <w:rPr>
+                <w:rFonts w:ascii="Arial" w:cs="Arial" w:eastAsia="Arial" w:hAnsi="Arial"/>
+                <w:b/>
+                <w:bCs/>
+                <w:color w:val="C9A227"/>
+                <w:sz w:val="13"/>
+                <w:szCs w:val="13"/>
+              </w:rPr>
+              <w:t xml:space="preserve">LOAD</w:t>
+            </w:r>
+          </w:p>
+        </w:tc>
+        <w:tc>
+          <w:tcPr>
+            <w:tcW w:type="dxa" w:w="540"/>
+            <w:tcBorders>
+              <w:top w:val="none" w:color="FFFFFF" w:sz="0"/>
+              <w:left w:val="none" w:color="FFFFFF" w:sz="0"/>
+              <w:bottom w:val="none" w:color="FFFFFF" w:sz="0"/>
+              <w:right w:val="none" w:color="FFFFFF" w:sz="0"/>
+            </w:tcBorders>
+            <w:shd w:fill="F5E8C0" w:color="auto" w:val="clear"/>
+            <w:tcMar>
+              <w:top w:type="dxa" w:w="40"/>
+              <w:left w:type="dxa" w:w="80"/>
+              <w:bottom w:type="dxa" w:w="40"/>
+              <w:right w:type="dxa" w:w="80"/>
+            </w:tcMar>
+            <w:vAlign w:val="center"/>
+          </w:tcPr>
+          <w:p>
+            <w:pPr>
+              <w:jc w:val="center"/>
+            </w:pPr>
+            <w:r>
+              <w:rPr>
+                <w:rFonts w:ascii="Arial" w:cs="Arial" w:eastAsia="Arial" w:hAnsi="Arial"/>
+                <w:b/>
+                <w:bCs/>
+                <w:color w:val="C9A227"/>
+                <w:sz w:val="13"/>
+                <w:szCs w:val="13"/>
+              </w:rPr>
+              <w:t xml:space="preserve">TEMPO</w:t>
+            </w:r>
+          </w:p>
+        </w:tc>
+        <w:tc>
+          <w:tcPr>
+            <w:tcW w:type="dxa" w:w="440"/>
+            <w:tcBorders>
+              <w:top w:val="none" w:color="FFFFFF" w:sz="0"/>
+              <w:left w:val="none" w:color="FFFFFF" w:sz="0"/>
+              <w:bottom w:val="none" w:color="FFFFFF" w:sz="0"/>
+              <w:right w:val="none" w:color="FFFFFF" w:sz="0"/>
+            </w:tcBorders>
+            <w:shd w:fill="F5E8C0" w:color="auto" w:val="clear"/>
+            <w:tcMar>
+              <w:top w:type="dxa" w:w="40"/>
+              <w:left w:type="dxa" w:w="80"/>
+              <w:bottom w:type="dxa" w:w="40"/>
+              <w:right w:type="dxa" w:w="80"/>
+            </w:tcMar>
+            <w:vAlign w:val="center"/>
+          </w:tcPr>
+          <w:p>
+            <w:pPr>
+              <w:jc w:val="center"/>
+            </w:pPr>
+            <w:r>
+              <w:rPr>
+                <w:rFonts w:ascii="Arial" w:cs="Arial" w:eastAsia="Arial" w:hAnsi="Arial"/>
+                <w:b/>
+                <w:bCs/>
+                <w:color w:val="C9A227"/>
+                <w:sz w:val="13"/>
+                <w:szCs w:val="13"/>
+              </w:rPr>
+              <w:t xml:space="preserve">REST</w:t>
+            </w:r>
+          </w:p>
+        </w:tc>
+        <w:tc>
+          <w:tcPr>
+            <w:tcW w:type="dxa" w:w="5580"/>
+            <w:tcBorders>
+              <w:top w:val="none" w:color="FFFFFF" w:sz="0"/>
+              <w:left w:val="none" w:color="FFFFFF" w:sz="0"/>
+              <w:bottom w:val="none" w:color="FFFFFF" w:sz="0"/>
+              <w:right w:val="none" w:color="FFFFFF" w:sz="0"/>
+            </w:tcBorders>
+            <w:shd w:fill="F5E8C0" w:color="auto" w:val="clear"/>
+            <w:tcMar>
+              <w:top w:type="dxa" w:w="40"/>
+              <w:left w:type="dxa" w:w="80"/>
+              <w:bottom w:type="dxa" w:w="40"/>
+              <w:right w:type="dxa" w:w="80"/>
+            </w:tcMar>
+            <w:vAlign w:val="center"/>
+          </w:tcPr>
+          <w:p>
+            <w:pPr>
+              <w:jc w:val="left"/>
+            </w:pPr>
+            <w:r>
+              <w:rPr>
+                <w:rFonts w:ascii="Arial" w:cs="Arial" w:eastAsia="Arial" w:hAnsi="Arial"/>
+                <w:b/>
+                <w:bCs/>
+                <w:color w:val="C9A227"/>
+                <w:sz w:val="15"/>
+                <w:szCs w:val="15"/>
+              </w:rPr>
+              <w:t xml:space="preserve">COACHING CUE</w:t>
+            </w:r>
+          </w:p>
+        </w:tc>
+      </w:tr>
+      <w:tr>
+        <w:tc>
+          <w:tcPr>
+            <w:tcW w:type="dxa" w:w="2400"/>
+            <w:tcBorders>
+              <w:top w:val="none" w:color="FFFFFF" w:sz="0"/>
+              <w:left w:val="none" w:color="FFFFFF" w:sz="0"/>
+              <w:bottom w:val="none" w:color="FFFFFF" w:sz="0"/>
+              <w:right w:val="none" w:color="FFFFFF" w:sz="0"/>
+            </w:tcBorders>
+            <w:shd w:fill="FAF3E0" w:color="auto" w:val="clear"/>
+            <w:tcMar>
+              <w:top w:type="dxa" w:w="40"/>
+              <w:left w:type="dxa" w:w="80"/>
+              <w:bottom w:type="dxa" w:w="40"/>
+              <w:right w:type="dxa" w:w="80"/>
+            </w:tcMar>
+            <w:vAlign w:val="center"/>
+          </w:tcPr>
+          <w:p>
+            <w:r>
+              <w:rPr>
+                <w:rFonts w:ascii="Arial" w:cs="Arial" w:eastAsia="Arial" w:hAnsi="Arial"/>
+                <w:b/>
+                <w:bCs/>
+                <w:color w:val="2C2C2C"/>
+                <w:sz w:val="18"/>
+                <w:szCs w:val="18"/>
+              </w:rPr>
+              <w:t xml:space="preserve">Farmers Carry (DB, Both Hands)</w:t>
+            </w:r>
+          </w:p>
+        </w:tc>
+        <w:tc>
+          <w:tcPr>
+            <w:tcW w:type="dxa" w:w="380"/>
+            <w:tcBorders>
+              <w:top w:val="none" w:color="FFFFFF" w:sz="0"/>
+              <w:left w:val="none" w:color="FFFFFF" w:sz="0"/>
+              <w:bottom w:val="none" w:color="FFFFFF" w:sz="0"/>
+              <w:right w:val="none" w:color="FFFFFF" w:sz="0"/>
+            </w:tcBorders>
+            <w:shd w:fill="FAF3E0" w:color="auto" w:val="clear"/>
+            <w:tcMar>
+              <w:top w:type="dxa" w:w="40"/>
+              <w:left w:type="dxa" w:w="80"/>
+              <w:bottom w:type="dxa" w:w="40"/>
+              <w:right w:type="dxa" w:w="80"/>
+            </w:tcMar>
+            <w:vAlign w:val="center"/>
+          </w:tcPr>
+          <w:p>
+            <w:pPr>
+              <w:jc w:val="center"/>
+            </w:pPr>
+            <w:r>
+              <w:rPr>
+                <w:rFonts w:ascii="Arial" w:cs="Arial" w:eastAsia="Arial" w:hAnsi="Arial"/>
+                <w:color w:val="6B6B6B"/>
+                <w:sz w:val="15"/>
+                <w:szCs w:val="15"/>
+              </w:rPr>
+              <w:t xml:space="preserve">2</w:t>
+            </w:r>
+          </w:p>
+        </w:tc>
+        <w:tc>
+          <w:tcPr>
+            <w:tcW w:type="dxa" w:w="420"/>
+            <w:tcBorders>
+              <w:top w:val="none" w:color="FFFFFF" w:sz="0"/>
+              <w:left w:val="none" w:color="FFFFFF" w:sz="0"/>
+              <w:bottom w:val="none" w:color="FFFFFF" w:sz="0"/>
+              <w:right w:val="none" w:color="FFFFFF" w:sz="0"/>
+            </w:tcBorders>
+            <w:shd w:fill="FAF3E0" w:color="auto" w:val="clear"/>
+            <w:tcMar>
+              <w:top w:type="dxa" w:w="40"/>
+              <w:left w:type="dxa" w:w="80"/>
+              <w:bottom w:type="dxa" w:w="40"/>
+              <w:right w:type="dxa" w:w="80"/>
+            </w:tcMar>
+            <w:vAlign w:val="center"/>
+          </w:tcPr>
+          <w:p>
+            <w:pPr>
+              <w:jc w:val="center"/>
+            </w:pPr>
+            <w:r>
+              <w:rPr>
+                <w:rFonts w:ascii="Arial" w:cs="Arial" w:eastAsia="Arial" w:hAnsi="Arial"/>
+                <w:color w:val="6B6B6B"/>
+                <w:sz w:val="15"/>
+                <w:szCs w:val="15"/>
+              </w:rPr>
+              <w:t xml:space="preserve">20–30 yd</w:t>
+            </w:r>
+          </w:p>
+        </w:tc>
+        <w:tc>
+          <w:tcPr>
+            <w:tcW w:type="dxa" w:w="680"/>
+            <w:tcBorders>
+              <w:top w:val="none" w:color="FFFFFF" w:sz="0"/>
+              <w:left w:val="none" w:color="FFFFFF" w:sz="0"/>
+              <w:bottom w:val="none" w:color="FFFFFF" w:sz="0"/>
+              <w:right w:val="none" w:color="FFFFFF" w:sz="0"/>
+            </w:tcBorders>
+            <w:shd w:fill="FAF3E0" w:color="auto" w:val="clear"/>
+            <w:tcMar>
+              <w:top w:type="dxa" w:w="40"/>
+              <w:left w:type="dxa" w:w="80"/>
+              <w:bottom w:type="dxa" w:w="40"/>
+              <w:right w:type="dxa" w:w="80"/>
+            </w:tcMar>
+            <w:vAlign w:val="center"/>
+          </w:tcPr>
+          <w:p>
+            <w:pPr>
+              <w:jc w:val="center"/>
+            </w:pPr>
+            <w:r>
+              <w:rPr>
+                <w:rFonts w:ascii="Arial" w:cs="Arial" w:eastAsia="Arial" w:hAnsi="Arial"/>
+                <w:color w:val="6B6B6B"/>
+                <w:sz w:val="15"/>
+                <w:szCs w:val="15"/>
+              </w:rPr>
+              <w:t xml:space="preserve">20–25 lbs/hand</w:t>
+            </w:r>
+          </w:p>
+        </w:tc>
+        <w:tc>
+          <w:tcPr>
+            <w:tcW w:type="dxa" w:w="540"/>
+            <w:tcBorders>
+              <w:top w:val="none" w:color="FFFFFF" w:sz="0"/>
+              <w:left w:val="none" w:color="FFFFFF" w:sz="0"/>
+              <w:bottom w:val="none" w:color="FFFFFF" w:sz="0"/>
+              <w:right w:val="none" w:color="FFFFFF" w:sz="0"/>
+            </w:tcBorders>
+            <w:shd w:fill="FAF3E0" w:color="auto" w:val="clear"/>
+            <w:tcMar>
+              <w:top w:type="dxa" w:w="40"/>
+              <w:left w:type="dxa" w:w="80"/>
+              <w:bottom w:type="dxa" w:w="40"/>
+              <w:right w:type="dxa" w:w="80"/>
+            </w:tcMar>
+            <w:vAlign w:val="center"/>
+          </w:tcPr>
+          <w:p>
+            <w:pPr>
+              <w:jc w:val="center"/>
+            </w:pPr>
+            <w:r>
+              <w:rPr>
+                <w:rFonts w:ascii="Arial" w:cs="Arial" w:eastAsia="Arial" w:hAnsi="Arial"/>
+                <w:color w:val="6B6B6B"/>
+                <w:sz w:val="15"/>
+                <w:szCs w:val="15"/>
+              </w:rPr>
+              <w:t xml:space="preserve">controlled</w:t>
+            </w:r>
+          </w:p>
+        </w:tc>
+        <w:tc>
+          <w:tcPr>
+            <w:tcW w:type="dxa" w:w="440"/>
+            <w:tcBorders>
+              <w:top w:val="none" w:color="FFFFFF" w:sz="0"/>
+              <w:left w:val="none" w:color="FFFFFF" w:sz="0"/>
+              <w:bottom w:val="none" w:color="FFFFFF" w:sz="0"/>
+              <w:right w:val="none" w:color="FFFFFF" w:sz="0"/>
+            </w:tcBorders>
+            <w:shd w:fill="FAF3E0" w:color="auto" w:val="clear"/>
+            <w:tcMar>
+              <w:top w:type="dxa" w:w="40"/>
+              <w:left w:type="dxa" w:w="80"/>
+              <w:bottom w:type="dxa" w:w="40"/>
+              <w:right w:type="dxa" w:w="80"/>
+            </w:tcMar>
+            <w:vAlign w:val="center"/>
+          </w:tcPr>
+          <w:p>
+            <w:pPr>
+              <w:jc w:val="center"/>
+            </w:pPr>
+            <w:r>
+              <w:rPr>
+                <w:rFonts w:ascii="Arial" w:cs="Arial" w:eastAsia="Arial" w:hAnsi="Arial"/>
+                <w:color w:val="6B6B6B"/>
+                <w:sz w:val="15"/>
+                <w:szCs w:val="15"/>
+              </w:rPr>
+              <w:t xml:space="preserve">60s</w:t>
+            </w:r>
+          </w:p>
+        </w:tc>
+        <w:tc>
+          <w:tcPr>
+            <w:tcW w:type="dxa" w:w="5580"/>
+            <w:tcBorders>
+              <w:top w:val="none" w:color="FFFFFF" w:sz="0"/>
+              <w:left w:val="none" w:color="FFFFFF" w:sz="0"/>
+              <w:bottom w:val="none" w:color="FFFFFF" w:sz="0"/>
+              <w:right w:val="none" w:color="FFFFFF" w:sz="0"/>
+            </w:tcBorders>
+            <w:shd w:fill="FAF3E0" w:color="auto" w:val="clear"/>
+            <w:tcMar>
+              <w:top w:type="dxa" w:w="40"/>
+              <w:left w:type="dxa" w:w="80"/>
+              <w:bottom w:type="dxa" w:w="40"/>
+              <w:right w:type="dxa" w:w="80"/>
+            </w:tcMar>
+            <w:vAlign w:val="center"/>
+          </w:tcPr>
+          <w:p>
+            <w:r>
+              <w:rPr>
+                <w:rFonts w:ascii="Arial" w:cs="Arial" w:eastAsia="Arial" w:hAnsi="Arial"/>
+                <w:color w:val="6B6B6B"/>
+                <w:sz w:val="17"/>
+                <w:szCs w:val="17"/>
+              </w:rPr>
+              <w:t xml:space="preserve">Shoulders packed down and back, tall posture, quick tight steps.</w:t>
+            </w:r>
+            <w:r>
+              <w:rPr>
+                <w:rFonts w:ascii="Arial" w:cs="Arial" w:eastAsia="Arial" w:hAnsi="Arial"/>
+                <w:i/>
+                <w:iCs/>
+                <w:color w:val="00695C"/>
+                <w:sz w:val="14"/>
+                <w:szCs w:val="14"/>
+              </w:rPr>
+              <w:t xml:space="preserve">  Distance &amp; quality governed — no RIR target</w:t>
+            </w:r>
+          </w:p>
+        </w:tc>
+      </w:tr>
+    </w:tbl>
+    <w:p>
+      <w:pPr>
+        <w:spacing w:after="100"/>
+      </w:pPr>
+    </w:p>
+    <w:p>
+      <w:pPr>
+        <w:spacing w:after="60" w:before="120"/>
+      </w:pPr>
+      <w:r>
+        <w:rPr>
+          <w:rFonts w:ascii="Arial" w:cs="Arial" w:eastAsia="Arial" w:hAnsi="Arial"/>
+          <w:b/>
+          <w:bCs/>
+          <w:color w:val="C9A227"/>
+          <w:sz w:val="17"/>
+          <w:szCs w:val="17"/>
+        </w:rPr>
+        <w:t xml:space="preserve">F — METABOLIC FINISHER</w:t>
       </w:r>
     </w:p>
     <w:p>
@@ -12223,7 +14013,7 @@
           <w:sz w:val="17"/>
           <w:szCs w:val="17"/>
         </w:rPr>
-        <w:t xml:space="preserve">B — PRIMARY STRENGTH — HIP THRUST &amp; SINGLE-LEG RDL</w:t>
+        <w:t xml:space="preserve">B — PRIMARY COMPOUND — DB HIP THRUST</w:t>
       </w:r>
     </w:p>
     <w:p>
@@ -12248,7 +14038,7 @@
           <w:sz w:val="17"/>
           <w:szCs w:val="17"/>
         </w:rPr>
-        <w:t xml:space="preserve">Hip Thrust tested at 55 lbs x8 (Epley 1RM ≈70 lbs); Week 1 trains at 55 lbs, climbing to 60 lbs by Week 4. Single-Leg RDL tested at 20 lbs/hand x5 (Epley 1RM ≈23 lbs); Week 1 trains at 17.5 lbs/hand, climbing to 20 lbs/hand — left leg leads every set.</w:t>
+        <w:t xml:space="preserve">The day's main lift, built on her strongest tested number. Hip Thrust tested at 55 lbs x8 (Epley 1RM ≈70 lbs); Week 1 trains at 55 lbs, climbing to 60 lbs by Week 4. If the day calls for a variation, rotate between: a floor glute bridge (the simplest regression), a B-stance hip thrust (left leg takes the working share), or a single-leg glute bridge (left leg leads). The bench-supported DB hip thrust stays the lift we track and retest.</w:t>
       </w:r>
     </w:p>
     <w:tbl>
@@ -12759,6 +14549,74 @@
           </w:p>
         </w:tc>
       </w:tr>
+    </w:tbl>
+    <w:p>
+      <w:pPr>
+        <w:spacing w:after="100"/>
+      </w:pPr>
+    </w:p>
+    <w:p>
+      <w:pPr>
+        <w:spacing w:after="60" w:before="120"/>
+      </w:pPr>
+      <w:r>
+        <w:rPr>
+          <w:rFonts w:ascii="Arial" w:cs="Arial" w:eastAsia="Arial" w:hAnsi="Arial"/>
+          <w:b/>
+          <w:bCs/>
+          <w:color w:val="C9A227"/>
+          <w:sz w:val="17"/>
+          <w:szCs w:val="17"/>
+        </w:rPr>
+        <w:t xml:space="preserve">C — ACCESSORY — SINGLE-LEG RDL (LEFT-LED)</w:t>
+      </w:r>
+    </w:p>
+    <w:p>
+      <w:pPr>
+        <w:spacing w:after="80"/>
+      </w:pPr>
+      <w:r>
+        <w:rPr>
+          <w:rFonts w:ascii="Arial" w:cs="Arial" w:eastAsia="Arial" w:hAnsi="Arial"/>
+          <w:b/>
+          <w:bCs/>
+          <w:color w:val="C9A227"/>
+          <w:sz w:val="17"/>
+          <w:szCs w:val="17"/>
+        </w:rPr>
+        <w:t xml:space="preserve">Load Target:  </w:t>
+      </w:r>
+      <w:r>
+        <w:rPr>
+          <w:rFonts w:ascii="Arial" w:cs="Arial" w:eastAsia="Arial" w:hAnsi="Arial"/>
+          <w:color w:val="2C2C2C"/>
+          <w:sz w:val="17"/>
+          <w:szCs w:val="17"/>
+        </w:rPr>
+        <w:t xml:space="preserve">The unilateral accessory directly behind the hip thrust — same posterior chain, worked one leg at a time with the left leading. Tested at 20 lbs/hand x5 (Epley 1RM ≈23 lbs); Week 1 trains at 17.5 lbs/hand, climbing to 20 lbs/hand — left leg leads every set.</w:t>
+      </w:r>
+    </w:p>
+    <w:tbl>
+      <w:tblPr>
+        <w:tblW w:type="dxa" w:w="10440"/>
+        <w:tblBorders>
+          <w:top w:val="none" w:color="FFFFFF" w:sz="0"/>
+          <w:left w:val="none" w:color="FFFFFF" w:sz="0"/>
+          <w:bottom w:val="none" w:color="FFFFFF" w:sz="0"/>
+          <w:right w:val="none" w:color="FFFFFF" w:sz="0"/>
+          <w:insideH w:val="single" w:color="auto" w:sz="4"/>
+          <w:insideV w:val="single" w:color="auto" w:sz="4"/>
+        </w:tblBorders>
+      </w:tblPr>
+      <w:tblGrid>
+        <w:gridCol w:w="2400"/>
+        <w:gridCol w:w="380"/>
+        <w:gridCol w:w="420"/>
+        <w:gridCol w:w="680"/>
+        <w:gridCol w:w="540"/>
+        <w:gridCol w:w="440"/>
+        <w:gridCol w:w="5580"/>
+      </w:tblGrid>
       <w:tr>
         <w:tc>
           <w:tcPr>
@@ -12769,7 +14627,254 @@
               <w:bottom w:val="none" w:color="FFFFFF" w:sz="0"/>
               <w:right w:val="none" w:color="FFFFFF" w:sz="0"/>
             </w:tcBorders>
-            <w:shd w:fill="FFFFFF" w:color="auto" w:val="clear"/>
+            <w:shd w:fill="F5E8C0" w:color="auto" w:val="clear"/>
+            <w:tcMar>
+              <w:top w:type="dxa" w:w="40"/>
+              <w:left w:type="dxa" w:w="80"/>
+              <w:bottom w:type="dxa" w:w="40"/>
+              <w:right w:type="dxa" w:w="80"/>
+            </w:tcMar>
+            <w:vAlign w:val="center"/>
+          </w:tcPr>
+          <w:p>
+            <w:pPr>
+              <w:jc w:val="left"/>
+            </w:pPr>
+            <w:r>
+              <w:rPr>
+                <w:rFonts w:ascii="Arial" w:cs="Arial" w:eastAsia="Arial" w:hAnsi="Arial"/>
+                <w:b/>
+                <w:bCs/>
+                <w:color w:val="C9A227"/>
+                <w:sz w:val="15"/>
+                <w:szCs w:val="15"/>
+              </w:rPr>
+              <w:t xml:space="preserve">EXERCISE</w:t>
+            </w:r>
+          </w:p>
+        </w:tc>
+        <w:tc>
+          <w:tcPr>
+            <w:tcW w:type="dxa" w:w="380"/>
+            <w:tcBorders>
+              <w:top w:val="none" w:color="FFFFFF" w:sz="0"/>
+              <w:left w:val="none" w:color="FFFFFF" w:sz="0"/>
+              <w:bottom w:val="none" w:color="FFFFFF" w:sz="0"/>
+              <w:right w:val="none" w:color="FFFFFF" w:sz="0"/>
+            </w:tcBorders>
+            <w:shd w:fill="F5E8C0" w:color="auto" w:val="clear"/>
+            <w:tcMar>
+              <w:top w:type="dxa" w:w="40"/>
+              <w:left w:type="dxa" w:w="80"/>
+              <w:bottom w:type="dxa" w:w="40"/>
+              <w:right w:type="dxa" w:w="80"/>
+            </w:tcMar>
+            <w:vAlign w:val="center"/>
+          </w:tcPr>
+          <w:p>
+            <w:pPr>
+              <w:jc w:val="center"/>
+            </w:pPr>
+            <w:r>
+              <w:rPr>
+                <w:rFonts w:ascii="Arial" w:cs="Arial" w:eastAsia="Arial" w:hAnsi="Arial"/>
+                <w:b/>
+                <w:bCs/>
+                <w:color w:val="C9A227"/>
+                <w:sz w:val="13"/>
+                <w:szCs w:val="13"/>
+              </w:rPr>
+              <w:t xml:space="preserve">SETS</w:t>
+            </w:r>
+          </w:p>
+        </w:tc>
+        <w:tc>
+          <w:tcPr>
+            <w:tcW w:type="dxa" w:w="420"/>
+            <w:tcBorders>
+              <w:top w:val="none" w:color="FFFFFF" w:sz="0"/>
+              <w:left w:val="none" w:color="FFFFFF" w:sz="0"/>
+              <w:bottom w:val="none" w:color="FFFFFF" w:sz="0"/>
+              <w:right w:val="none" w:color="FFFFFF" w:sz="0"/>
+            </w:tcBorders>
+            <w:shd w:fill="F5E8C0" w:color="auto" w:val="clear"/>
+            <w:tcMar>
+              <w:top w:type="dxa" w:w="40"/>
+              <w:left w:type="dxa" w:w="80"/>
+              <w:bottom w:type="dxa" w:w="40"/>
+              <w:right w:type="dxa" w:w="80"/>
+            </w:tcMar>
+            <w:vAlign w:val="center"/>
+          </w:tcPr>
+          <w:p>
+            <w:pPr>
+              <w:jc w:val="center"/>
+            </w:pPr>
+            <w:r>
+              <w:rPr>
+                <w:rFonts w:ascii="Arial" w:cs="Arial" w:eastAsia="Arial" w:hAnsi="Arial"/>
+                <w:b/>
+                <w:bCs/>
+                <w:color w:val="C9A227"/>
+                <w:sz w:val="13"/>
+                <w:szCs w:val="13"/>
+              </w:rPr>
+              <w:t xml:space="preserve">REPS</w:t>
+            </w:r>
+          </w:p>
+        </w:tc>
+        <w:tc>
+          <w:tcPr>
+            <w:tcW w:type="dxa" w:w="680"/>
+            <w:tcBorders>
+              <w:top w:val="none" w:color="FFFFFF" w:sz="0"/>
+              <w:left w:val="none" w:color="FFFFFF" w:sz="0"/>
+              <w:bottom w:val="none" w:color="FFFFFF" w:sz="0"/>
+              <w:right w:val="none" w:color="FFFFFF" w:sz="0"/>
+            </w:tcBorders>
+            <w:shd w:fill="F5E8C0" w:color="auto" w:val="clear"/>
+            <w:tcMar>
+              <w:top w:type="dxa" w:w="40"/>
+              <w:left w:type="dxa" w:w="80"/>
+              <w:bottom w:type="dxa" w:w="40"/>
+              <w:right w:type="dxa" w:w="80"/>
+            </w:tcMar>
+            <w:vAlign w:val="center"/>
+          </w:tcPr>
+          <w:p>
+            <w:pPr>
+              <w:jc w:val="center"/>
+            </w:pPr>
+            <w:r>
+              <w:rPr>
+                <w:rFonts w:ascii="Arial" w:cs="Arial" w:eastAsia="Arial" w:hAnsi="Arial"/>
+                <w:b/>
+                <w:bCs/>
+                <w:color w:val="C9A227"/>
+                <w:sz w:val="13"/>
+                <w:szCs w:val="13"/>
+              </w:rPr>
+              <w:t xml:space="preserve">LOAD</w:t>
+            </w:r>
+          </w:p>
+        </w:tc>
+        <w:tc>
+          <w:tcPr>
+            <w:tcW w:type="dxa" w:w="540"/>
+            <w:tcBorders>
+              <w:top w:val="none" w:color="FFFFFF" w:sz="0"/>
+              <w:left w:val="none" w:color="FFFFFF" w:sz="0"/>
+              <w:bottom w:val="none" w:color="FFFFFF" w:sz="0"/>
+              <w:right w:val="none" w:color="FFFFFF" w:sz="0"/>
+            </w:tcBorders>
+            <w:shd w:fill="F5E8C0" w:color="auto" w:val="clear"/>
+            <w:tcMar>
+              <w:top w:type="dxa" w:w="40"/>
+              <w:left w:type="dxa" w:w="80"/>
+              <w:bottom w:type="dxa" w:w="40"/>
+              <w:right w:type="dxa" w:w="80"/>
+            </w:tcMar>
+            <w:vAlign w:val="center"/>
+          </w:tcPr>
+          <w:p>
+            <w:pPr>
+              <w:jc w:val="center"/>
+            </w:pPr>
+            <w:r>
+              <w:rPr>
+                <w:rFonts w:ascii="Arial" w:cs="Arial" w:eastAsia="Arial" w:hAnsi="Arial"/>
+                <w:b/>
+                <w:bCs/>
+                <w:color w:val="C9A227"/>
+                <w:sz w:val="13"/>
+                <w:szCs w:val="13"/>
+              </w:rPr>
+              <w:t xml:space="preserve">TEMPO</w:t>
+            </w:r>
+          </w:p>
+        </w:tc>
+        <w:tc>
+          <w:tcPr>
+            <w:tcW w:type="dxa" w:w="440"/>
+            <w:tcBorders>
+              <w:top w:val="none" w:color="FFFFFF" w:sz="0"/>
+              <w:left w:val="none" w:color="FFFFFF" w:sz="0"/>
+              <w:bottom w:val="none" w:color="FFFFFF" w:sz="0"/>
+              <w:right w:val="none" w:color="FFFFFF" w:sz="0"/>
+            </w:tcBorders>
+            <w:shd w:fill="F5E8C0" w:color="auto" w:val="clear"/>
+            <w:tcMar>
+              <w:top w:type="dxa" w:w="40"/>
+              <w:left w:type="dxa" w:w="80"/>
+              <w:bottom w:type="dxa" w:w="40"/>
+              <w:right w:type="dxa" w:w="80"/>
+            </w:tcMar>
+            <w:vAlign w:val="center"/>
+          </w:tcPr>
+          <w:p>
+            <w:pPr>
+              <w:jc w:val="center"/>
+            </w:pPr>
+            <w:r>
+              <w:rPr>
+                <w:rFonts w:ascii="Arial" w:cs="Arial" w:eastAsia="Arial" w:hAnsi="Arial"/>
+                <w:b/>
+                <w:bCs/>
+                <w:color w:val="C9A227"/>
+                <w:sz w:val="13"/>
+                <w:szCs w:val="13"/>
+              </w:rPr>
+              <w:t xml:space="preserve">REST</w:t>
+            </w:r>
+          </w:p>
+        </w:tc>
+        <w:tc>
+          <w:tcPr>
+            <w:tcW w:type="dxa" w:w="5580"/>
+            <w:tcBorders>
+              <w:top w:val="none" w:color="FFFFFF" w:sz="0"/>
+              <w:left w:val="none" w:color="FFFFFF" w:sz="0"/>
+              <w:bottom w:val="none" w:color="FFFFFF" w:sz="0"/>
+              <w:right w:val="none" w:color="FFFFFF" w:sz="0"/>
+            </w:tcBorders>
+            <w:shd w:fill="F5E8C0" w:color="auto" w:val="clear"/>
+            <w:tcMar>
+              <w:top w:type="dxa" w:w="40"/>
+              <w:left w:type="dxa" w:w="80"/>
+              <w:bottom w:type="dxa" w:w="40"/>
+              <w:right w:type="dxa" w:w="80"/>
+            </w:tcMar>
+            <w:vAlign w:val="center"/>
+          </w:tcPr>
+          <w:p>
+            <w:pPr>
+              <w:jc w:val="left"/>
+            </w:pPr>
+            <w:r>
+              <w:rPr>
+                <w:rFonts w:ascii="Arial" w:cs="Arial" w:eastAsia="Arial" w:hAnsi="Arial"/>
+                <w:b/>
+                <w:bCs/>
+                <w:color w:val="C9A227"/>
+                <w:sz w:val="15"/>
+                <w:szCs w:val="15"/>
+              </w:rPr>
+              <w:t xml:space="preserve">COACHING CUE</w:t>
+            </w:r>
+          </w:p>
+        </w:tc>
+      </w:tr>
+      <w:tr>
+        <w:tc>
+          <w:tcPr>
+            <w:tcW w:type="dxa" w:w="2400"/>
+            <w:tcBorders>
+              <w:top w:val="none" w:color="FFFFFF" w:sz="0"/>
+              <w:left w:val="none" w:color="FFFFFF" w:sz="0"/>
+              <w:bottom w:val="none" w:color="FFFFFF" w:sz="0"/>
+              <w:right w:val="none" w:color="FFFFFF" w:sz="0"/>
+            </w:tcBorders>
+            <w:shd w:fill="FAF3E0" w:color="auto" w:val="clear"/>
             <w:tcMar>
               <w:top w:type="dxa" w:w="40"/>
               <w:left w:type="dxa" w:w="80"/>
@@ -12814,7 +14919,7 @@
               <w:bottom w:val="none" w:color="FFFFFF" w:sz="0"/>
               <w:right w:val="none" w:color="FFFFFF" w:sz="0"/>
             </w:tcBorders>
-            <w:shd w:fill="FFFFFF" w:color="auto" w:val="clear"/>
+            <w:shd w:fill="FAF3E0" w:color="auto" w:val="clear"/>
             <w:tcMar>
               <w:top w:type="dxa" w:w="40"/>
               <w:left w:type="dxa" w:w="80"/>
@@ -12847,7 +14952,7 @@
               <w:bottom w:val="none" w:color="FFFFFF" w:sz="0"/>
               <w:right w:val="none" w:color="FFFFFF" w:sz="0"/>
             </w:tcBorders>
-            <w:shd w:fill="FFFFFF" w:color="auto" w:val="clear"/>
+            <w:shd w:fill="FAF3E0" w:color="auto" w:val="clear"/>
             <w:tcMar>
               <w:top w:type="dxa" w:w="40"/>
               <w:left w:type="dxa" w:w="80"/>
@@ -12880,7 +14985,7 @@
               <w:bottom w:val="none" w:color="FFFFFF" w:sz="0"/>
               <w:right w:val="none" w:color="FFFFFF" w:sz="0"/>
             </w:tcBorders>
-            <w:shd w:fill="FFFFFF" w:color="auto" w:val="clear"/>
+            <w:shd w:fill="FAF3E0" w:color="auto" w:val="clear"/>
             <w:tcMar>
               <w:top w:type="dxa" w:w="40"/>
               <w:left w:type="dxa" w:w="80"/>
@@ -12913,7 +15018,7 @@
               <w:bottom w:val="none" w:color="FFFFFF" w:sz="0"/>
               <w:right w:val="none" w:color="FFFFFF" w:sz="0"/>
             </w:tcBorders>
-            <w:shd w:fill="FFFFFF" w:color="auto" w:val="clear"/>
+            <w:shd w:fill="FAF3E0" w:color="auto" w:val="clear"/>
             <w:tcMar>
               <w:top w:type="dxa" w:w="40"/>
               <w:left w:type="dxa" w:w="80"/>
@@ -12946,7 +15051,7 @@
               <w:bottom w:val="none" w:color="FFFFFF" w:sz="0"/>
               <w:right w:val="none" w:color="FFFFFF" w:sz="0"/>
             </w:tcBorders>
-            <w:shd w:fill="FFFFFF" w:color="auto" w:val="clear"/>
+            <w:shd w:fill="FAF3E0" w:color="auto" w:val="clear"/>
             <w:tcMar>
               <w:top w:type="dxa" w:w="40"/>
               <w:left w:type="dxa" w:w="80"/>
@@ -12979,7 +15084,7 @@
               <w:bottom w:val="none" w:color="FFFFFF" w:sz="0"/>
               <w:right w:val="none" w:color="FFFFFF" w:sz="0"/>
             </w:tcBorders>
-            <w:shd w:fill="FFFFFF" w:color="auto" w:val="clear"/>
+            <w:shd w:fill="FAF3E0" w:color="auto" w:val="clear"/>
             <w:tcMar>
               <w:top w:type="dxa" w:w="40"/>
               <w:left w:type="dxa" w:w="80"/>
@@ -13031,7 +15136,7 @@
           <w:sz w:val="17"/>
           <w:szCs w:val="17"/>
         </w:rPr>
-        <w:t xml:space="preserve">C — LUNGE &amp; TIBIA/INNER-THIGH ACCESSORY</w:t>
+        <w:t xml:space="preserve">D — SECONDARY COMPOUND — LUNGE (LEFT-LED) &amp; TIBIA/INNER-THIGH ACCESSORY</w:t>
       </w:r>
     </w:p>
     <w:p>
@@ -13056,7 +15161,7 @@
           <w:sz w:val="17"/>
           <w:szCs w:val="17"/>
         </w:rPr>
-        <w:t xml:space="preserve">Lunge tested at 15 lbs/hand x8 (Epley 1RM ≈19 lbs) — Week 1 trains at 12.5 lbs/hand, climbing to 17.5 lbs/hand by Week 4. Tibialis and adductor work from Day 1 gets a lighter touch-up here to reinforce the pattern under load.</w:t>
+        <w:t xml:space="preserve">The day's second compound pattern — knee-dominant lunging, rotating off the hip-extension work above. Lunge tested at 15 lbs/hand x8 (Epley 1RM ≈19 lbs) — Week 1 trains at 12.5 lbs/hand, climbing to 17.5 lbs/hand by Week 4, left leg leading. If the lunge needs a variation: a DB step-up (left leg leads) or a static split squat covers the same knee-dominant territory; the reverse lunge stays the lift we track. Tibialis and adductor work from Day 1 gets a lighter touch-up here to reinforce the pattern under load.</w:t>
       </w:r>
     </w:p>
     <w:tbl>
@@ -14057,7 +16162,7 @@
           <w:sz w:val="17"/>
           <w:szCs w:val="17"/>
         </w:rPr>
-        <w:t xml:space="preserve">D — LOADED CARRY + CORE</w:t>
+        <w:t xml:space="preserve">E — FULL-BODY INTEGRATION — LOADED CARRY + CORE</w:t>
       </w:r>
     </w:p>
     <w:p>
@@ -14082,7 +16187,7 @@
           <w:sz w:val="17"/>
           <w:szCs w:val="17"/>
         </w:rPr>
-        <w:t xml:space="preserve">Farmers Carry tested at 30 lbs/hand — builds the deep spinal stabilizer strength that supports posture under all the compound lifts above. Plank closes the block.</w:t>
+        <w:t xml:space="preserve">The session's closing compound work — the carry pulls the day's hip-extension strength into upright, braced gait at her full tested working load (30 lbs/hand), building the deep spinal stabilizer strength that supports posture under all the compound lifts above. Distance and movement quality govern the carry, not an effort target. If a variation suits the day: a suitcase carry (one side at a time, alternating sides evenly — her arms read effectively even on the scan, so no side leads) or a front-rack carry (upright-posture bias). Plank closes the block.</w:t>
       </w:r>
     </w:p>
     <w:tbl>
@@ -14588,7 +16693,7 @@
                 <w:sz w:val="14"/>
                 <w:szCs w:val="14"/>
               </w:rPr>
-              <w:t xml:space="preserve">  2 RIR</w:t>
+              <w:t xml:space="preserve">  Distance &amp; quality governed — no RIR target</w:t>
             </w:r>
           </w:p>
         </w:tc>
@@ -14841,7 +16946,7 @@
           <w:sz w:val="17"/>
           <w:szCs w:val="17"/>
         </w:rPr>
-        <w:t xml:space="preserve">E — METABOLIC FINISHER</w:t>
+        <w:t xml:space="preserve">F — METABOLIC FINISHER</w:t>
       </w:r>
     </w:p>
     <w:p>
@@ -16521,7 +18626,7 @@
           <w:sz w:val="17"/>
           <w:szCs w:val="17"/>
         </w:rPr>
-        <w:t xml:space="preserve">Goblet Squat 30–35 lbs x8, Trap Bar Deadlift 65–70 lbs x6 at 2–3 RIR. Hip Thrust progressing toward 65 lbs x8. Seated OHP at 15 lbs x8 pain-free (matching tested baseline) — progress only as shoulder ROM allows. Incline Dumbbell Press progressing from 12.5 lbs/hand toward 15 lbs/hand, pain-free. Left-leg single-leg RDL load matched toward parity with right within 10%.</w:t>
+        <w:t xml:space="preserve">Goblet Squat 30–35 lbs x8, Trap Bar Deadlift 65–70 lbs x6 at 2–3 RIR. Hip Thrust progressing toward 65 lbs x8. Seated OHP at 15 lbs x8 pain-free (matching tested baseline) — progress only as shoulder ROM allows. Incline Dumbbell Press progressing from 12.5 lbs/hand toward 15 lbs/hand, pain-free. Left-leg single-leg RDL load matched toward parity with right within 10%. Week 4 closes with the strength check (the standing 4-week reassessment); Week 5 that follows is the planned deload week — same movements, sets reduced, loads held (see the deload note above) — before Weeks 6–8 rebuild.</w:t>
       </w:r>
     </w:p>
     <w:p>
@@ -16546,7 +18651,7 @@
           <w:sz w:val="17"/>
           <w:szCs w:val="17"/>
         </w:rPr>
-        <w:t xml:space="preserve">Squat/deadlift 8-week retest against today's new baseline (25 lbs / 55 lbs). Hip Thrust and OHP progressed from current working loads. Left/right leg LST gap reduced from 1.4 lbs. Plank hold past 50 seconds. Shoulder internal rotation strength improved with no pain flags logged.</w:t>
+        <w:t xml:space="preserve">Reached through the Week 4 strength check, the planned Week 5 deload, and the Weeks 6–8 rebuild. Squat/deadlift 8-week retest against today's new baseline (25 lbs / 55 lbs). Hip Thrust and OHP progressed from current working loads. Left/right leg LST gap reduced from 1.4 lbs. Plank hold past 50 seconds. Shoulder internal rotation strength improved with no pain flags logged.</w:t>
       </w:r>
     </w:p>
     <w:p>
@@ -16571,7 +18676,7 @@
           <w:sz w:val="17"/>
           <w:szCs w:val="17"/>
         </w:rPr>
-        <w:t xml:space="preserve">Rebook Styku scan at 8 weeks. Track: ALST Index trend (currently 6.32 kg/m², within normal reference range), VFA (currently 82.7 cm² — track the direction of travel rather than a risk band, and pair it with a waist-circumference measurement at the next scan), left/right leg LST gap (baseline 1.4 lbs, ≈8% relative — track the percentage narrowing, not just the raw pounds), lean mass (currently 96.6 lbs, Ideal Lean Mass marker — maintain or build further).</w:t>
+        <w:t xml:space="preserve">Two clocks run separately: strength is reassessed on the standing 4-week cadence (the Week 4 check, then the Week 8 retest at the end of the rebuild), while the Styku body-composition rescan books at 8 weeks — landing at the end of the Weeks 6–8 rebuild that follows the planned Week 5 deload, so the scan reads a consolidated block. Track: ALST Index trend (currently 6.32 kg/m², within normal reference range), VFA (currently 82.7 cm² — track the direction of travel rather than a risk band, and pair it with a waist-circumference measurement at the next scan), left/right leg LST gap (baseline 1.4 lbs, ≈8% relative — track the percentage narrowing, not just the raw pounds), lean mass (currently 96.6 lbs, Ideal Lean Mass marker — maintain or build further).</w:t>
       </w:r>
     </w:p>
     <w:p>

</xml_diff>